<commit_message>
Update with static and dynamic selection
</commit_message>
<xml_diff>
--- a/TransitRidershipReport_v2.docx
+++ b/TransitRidershipReport_v2.docx
@@ -301,7 +301,7 @@
           <w:sz w:val="21"/>
           <w:szCs w:val="21"/>
         </w:rPr>
-        <w:t>Section 3 — Estimation and Model Selection: baseline estimates and diagnostics; variable selection for each segment by backward elimination; the final static and dynamic models this produces; and how the final specification per segment is chosen.</w:t>
+        <w:t>Section 3 — Estimation and Model Selection: baseline estimates and diagnostics; a first-stage decision, per segment, between the static and dynamic (lagged-demand) form; backward elimination of the remaining regressors within whichever form was chosen; and the resulting final models.</w:t>
       </w:r>
     </w:p>
     <w:p>
@@ -1415,7 +1415,7 @@
           <w:sz w:val="21"/>
           <w:szCs w:val="21"/>
         </w:rPr>
-        <w:t>Each regressor applies to both models as a candidate (the two fare variables swap between “own” and “cross”); which of them survive in the final model for each class is decided by backward elimination (Section 3.2), not assumed here.</w:t>
+        <w:t>Each regressor applies to both models as a candidate (the two fare variables swap between “own” and “cross”). Whether the lag belongs in the model at all is decided first, per class, in Section 3.2; which of the remaining six regressors survive is then decided by backward elimination in Section 3.3.</w:t>
       </w:r>
     </w:p>
     <w:p>
@@ -1547,7 +1547,7 @@
           <w:sz w:val="21"/>
           <w:szCs w:val="21"/>
         </w:rPr>
-        <w:t>Proxies the cost of the private-vehicle alternative. It was included in the baseline model but, as Section 3.2 shows, it is the first regressor dropped by backward elimination in every one of the four elimination runs — it is never close to significant, consistent with it being highly correlated with regional employment.</w:t>
+        <w:t>Proxies the cost of the private-vehicle alternative. It was included in the baseline model but, as Section 3.3 shows, it is the first regressor dropped by backward elimination for both classes — it is never close to significant, consistent with it being highly correlated with regional employment.</w:t>
       </w:r>
     </w:p>
     <w:p>
@@ -1679,7 +1679,7 @@
           <w:sz w:val="21"/>
           <w:szCs w:val="21"/>
         </w:rPr>
-        <w:t>Tests for habit persistence and partial adjustment: past riders tend to keep riding (routines, season passes), and markets may take more than a quarter to respond fully to a fare or service change. Backward elimination (Section 3.2) treats the lag as an eliminable candidate like any other regressor, so whether it belongs in the final model is a result of the procedure, not an assumption.</w:t>
+        <w:t>Tests for habit persistence and partial adjustment: past riders tend to keep riding (routines, season passes), and markets may take more than a quarter to respond fully to a fare or service change. Unlike the other regressors, whether the lag enters the model at all is decided first (Section 3.2), using a significance test on its coefficient in the full baseline model, before backward elimination is applied to anything else.</w:t>
       </w:r>
     </w:p>
     <w:p>
@@ -1749,7 +1749,7 @@
           <w:sz w:val="21"/>
           <w:szCs w:val="21"/>
         </w:rPr>
-        <w:t xml:space="preserve">All models were estimated by ordinary least squares. Building the one-quarter lag costs each dynamic model its first observation (N = 35 versus 36). Because AIC and BIC are only comparable between models fitted to the same observations, every static-versus-dynamic comparison in Section 3.5 refits the static model on the common 35-quarter sample. Significance: *** p&lt;0.01, ** p&lt;0.05, * p&lt;0.10.</w:t>
+        <w:t>All models were estimated by ordinary least squares. Building the one-quarter lag costs each dynamic model its first observation (N = 35 versus 36). Because AIC and BIC are only comparable between models fitted to the same observations, the static/dynamic comparison in Section 3.2 refits the static model on the common 35-quarter sample. Significance: *** p&lt;0.01, ** p&lt;0.05, * p&lt;0.10.</w:t>
       </w:r>
     </w:p>
     <w:p>
@@ -2709,7 +2709,7 @@
           <w:sz w:val="24"/>
           <w:szCs w:val="24"/>
         </w:rPr>
-        <w:t>3.2 Variable Selection by Backward Elimination</w:t>
+        <w:t xml:space="preserve">3.2 Selecting Static or Dynamic</w:t>
       </w:r>
     </w:p>
     <w:p>
@@ -2723,7 +2723,606 @@
           <w:sz w:val="21"/>
           <w:szCs w:val="21"/>
         </w:rPr>
-        <w:t>Pairwise correlations flag ln(Employment) as the common thread: r = 0.88 with ln(AirFare), 0.77 with ln(GasPrice) and 0.76 with Economy ridership. Variance inflation factors confirm it: ln(Employment) has VIF = 13.4 and ln(Fare_1st) 11.7 in the baseline model, both above the rule-of-thumb limit of 10. Rather than testing a short list of hand-picked remedies, the final variable set and coefficients for each class are obtained by backward elimination: starting from all six candidate regressors (Fare_econ, Fare_1st, AirFare, GasPrice, Employment, Delays), the single candidate with the highest p-value is dropped and the model refit, repeating until everything left is significant at the 5% level. Quarter dummies are forced into every model throughout, based on the stable seasonality confirmed in Section 2.3. Each class is run twice — once with a static candidate set that excludes the lag, and once with a dynamic candidate set that includes the class's own one-quarter lag of log-ridership as a seventh candidate. Comparing the two outcomes is how the role of lagged demand is investigated, rather than assuming a lag term belongs in the model. Table 2 shows what each of the four runs dropped, in order, and what survived.</w:t>
+        <w:t xml:space="preserve">Before any variable is eliminated, each class is assigned a functional form using the full baseline models already estimated above (Table 1 and its dynamic counterpart): the dynamic (lagged-demand) form is selected only if the lag coefficient γ is statistically significant at 5% in the baseline model containing all six candidate regressors. AIC is shown as supporting evidence, but a non-significant γ is not overridden by an AIC difference below 2, the conventional threshold for meaningful evidence.</w:t>
+      </w:r>
+    </w:p>
+    <w:tbl>
+      <w:tblPr>
+        <w:tblW w:type="dxa" w:w="9280"/>
+        <w:tblBorders>
+          <w:top w:val="single" w:color="B7C6E0" w:sz="4"/>
+          <w:left w:val="single" w:color="B7C6E0" w:sz="4"/>
+          <w:bottom w:val="single" w:color="B7C6E0" w:sz="4"/>
+          <w:right w:val="single" w:color="B7C6E0" w:sz="4"/>
+          <w:insideH w:val="single" w:color="B7C6E0" w:sz="2"/>
+          <w:insideV w:val="single" w:color="B7C6E0" w:sz="2"/>
+        </w:tblBorders>
+      </w:tblPr>
+      <w:tblGrid>
+        <w:gridCol w:w="1400"/>
+        <w:gridCol w:w="1700"/>
+        <w:gridCol w:w="1300"/>
+        <w:gridCol w:w="1400"/>
+        <w:gridCol w:w="1780"/>
+        <w:gridCol w:w="1700"/>
+      </w:tblGrid>
+      <w:tr>
+        <w:trPr>
+          <w:tblHeader/>
+        </w:trPr>
+        <w:tc>
+          <w:tcPr>
+            <w:tcW w:type="dxa" w:w="1400"/>
+            <w:shd w:fill="1F3864" w:val="clear"/>
+            <w:tcMar>
+              <w:top w:type="dxa" w:w="60"/>
+              <w:left w:type="dxa" w:w="100"/>
+              <w:bottom w:type="dxa" w:w="60"/>
+              <w:right w:type="dxa" w:w="100"/>
+            </w:tcMar>
+            <w:vAlign w:val="center"/>
+          </w:tcPr>
+          <w:p>
+            <w:pPr>
+              <w:jc w:val="left"/>
+            </w:pPr>
+            <w:r>
+              <w:rPr>
+                <w:rFonts w:ascii="Calibri" w:cs="Calibri" w:eastAsia="Calibri" w:hAnsi="Calibri"/>
+                <w:b/>
+                <w:bCs/>
+                <w:color w:val="FFFFFF"/>
+                <w:sz w:val="19"/>
+                <w:szCs w:val="19"/>
+              </w:rPr>
+              <w:t xml:space="preserve">Class</w:t>
+            </w:r>
+          </w:p>
+        </w:tc>
+        <w:tc>
+          <w:tcPr>
+            <w:tcW w:type="dxa" w:w="1700"/>
+            <w:shd w:fill="1F3864" w:val="clear"/>
+            <w:tcMar>
+              <w:top w:type="dxa" w:w="60"/>
+              <w:left w:type="dxa" w:w="100"/>
+              <w:bottom w:type="dxa" w:w="60"/>
+              <w:right w:type="dxa" w:w="100"/>
+            </w:tcMar>
+            <w:vAlign w:val="center"/>
+          </w:tcPr>
+          <w:p>
+            <w:pPr>
+              <w:jc w:val="center"/>
+            </w:pPr>
+            <w:r>
+              <w:rPr>
+                <w:rFonts w:ascii="Calibri" w:cs="Calibri" w:eastAsia="Calibri" w:hAnsi="Calibri"/>
+                <w:b/>
+                <w:bCs/>
+                <w:color w:val="FFFFFF"/>
+                <w:sz w:val="19"/>
+                <w:szCs w:val="19"/>
+              </w:rPr>
+              <w:t xml:space="preserve">Baseline γ (p-value)</w:t>
+            </w:r>
+          </w:p>
+        </w:tc>
+        <w:tc>
+          <w:tcPr>
+            <w:tcW w:type="dxa" w:w="1300"/>
+            <w:shd w:fill="1F3864" w:val="clear"/>
+            <w:tcMar>
+              <w:top w:type="dxa" w:w="60"/>
+              <w:left w:type="dxa" w:w="100"/>
+              <w:bottom w:type="dxa" w:w="60"/>
+              <w:right w:type="dxa" w:w="100"/>
+            </w:tcMar>
+            <w:vAlign w:val="center"/>
+          </w:tcPr>
+          <w:p>
+            <w:pPr>
+              <w:jc w:val="center"/>
+            </w:pPr>
+            <w:r>
+              <w:rPr>
+                <w:rFonts w:ascii="Calibri" w:cs="Calibri" w:eastAsia="Calibri" w:hAnsi="Calibri"/>
+                <w:b/>
+                <w:bCs/>
+                <w:color w:val="FFFFFF"/>
+                <w:sz w:val="19"/>
+                <w:szCs w:val="19"/>
+              </w:rPr>
+              <w:t xml:space="preserve">AIC static</w:t>
+            </w:r>
+          </w:p>
+        </w:tc>
+        <w:tc>
+          <w:tcPr>
+            <w:tcW w:type="dxa" w:w="1400"/>
+            <w:shd w:fill="1F3864" w:val="clear"/>
+            <w:tcMar>
+              <w:top w:type="dxa" w:w="60"/>
+              <w:left w:type="dxa" w:w="100"/>
+              <w:bottom w:type="dxa" w:w="60"/>
+              <w:right w:type="dxa" w:w="100"/>
+            </w:tcMar>
+            <w:vAlign w:val="center"/>
+          </w:tcPr>
+          <w:p>
+            <w:pPr>
+              <w:jc w:val="center"/>
+            </w:pPr>
+            <w:r>
+              <w:rPr>
+                <w:rFonts w:ascii="Calibri" w:cs="Calibri" w:eastAsia="Calibri" w:hAnsi="Calibri"/>
+                <w:b/>
+                <w:bCs/>
+                <w:color w:val="FFFFFF"/>
+                <w:sz w:val="19"/>
+                <w:szCs w:val="19"/>
+              </w:rPr>
+              <w:t xml:space="preserve">AIC dynamic</w:t>
+            </w:r>
+          </w:p>
+        </w:tc>
+        <w:tc>
+          <w:tcPr>
+            <w:tcW w:type="dxa" w:w="1780"/>
+            <w:shd w:fill="1F3864" w:val="clear"/>
+            <w:tcMar>
+              <w:top w:type="dxa" w:w="60"/>
+              <w:left w:type="dxa" w:w="100"/>
+              <w:bottom w:type="dxa" w:w="60"/>
+              <w:right w:type="dxa" w:w="100"/>
+            </w:tcMar>
+            <w:vAlign w:val="center"/>
+          </w:tcPr>
+          <w:p>
+            <w:pPr>
+              <w:jc w:val="center"/>
+            </w:pPr>
+            <w:r>
+              <w:rPr>
+                <w:rFonts w:ascii="Calibri" w:cs="Calibri" w:eastAsia="Calibri" w:hAnsi="Calibri"/>
+                <w:b/>
+                <w:bCs/>
+                <w:color w:val="FFFFFF"/>
+                <w:sz w:val="19"/>
+                <w:szCs w:val="19"/>
+              </w:rPr>
+              <w:t xml:space="preserve">ΔAIC (dyn − stat)</w:t>
+            </w:r>
+          </w:p>
+        </w:tc>
+        <w:tc>
+          <w:tcPr>
+            <w:tcW w:type="dxa" w:w="1700"/>
+            <w:shd w:fill="1F3864" w:val="clear"/>
+            <w:tcMar>
+              <w:top w:type="dxa" w:w="60"/>
+              <w:left w:type="dxa" w:w="100"/>
+              <w:bottom w:type="dxa" w:w="60"/>
+              <w:right w:type="dxa" w:w="100"/>
+            </w:tcMar>
+            <w:vAlign w:val="center"/>
+          </w:tcPr>
+          <w:p>
+            <w:pPr>
+              <w:jc w:val="center"/>
+            </w:pPr>
+            <w:r>
+              <w:rPr>
+                <w:rFonts w:ascii="Calibri" w:cs="Calibri" w:eastAsia="Calibri" w:hAnsi="Calibri"/>
+                <w:b/>
+                <w:bCs/>
+                <w:color w:val="FFFFFF"/>
+                <w:sz w:val="19"/>
+                <w:szCs w:val="19"/>
+              </w:rPr>
+              <w:t xml:space="preserve">Form selected</w:t>
+            </w:r>
+          </w:p>
+        </w:tc>
+      </w:tr>
+      <w:tr>
+        <w:tc>
+          <w:tcPr>
+            <w:tcW w:type="dxa" w:w="1400"/>
+            <w:tcMar>
+              <w:top w:type="dxa" w:w="60"/>
+              <w:left w:type="dxa" w:w="100"/>
+              <w:bottom w:type="dxa" w:w="60"/>
+              <w:right w:type="dxa" w:w="100"/>
+            </w:tcMar>
+            <w:vAlign w:val="center"/>
+          </w:tcPr>
+          <w:p>
+            <w:pPr>
+              <w:jc w:val="left"/>
+            </w:pPr>
+            <w:r>
+              <w:rPr>
+                <w:rFonts w:ascii="Calibri" w:cs="Calibri" w:eastAsia="Calibri" w:hAnsi="Calibri"/>
+                <w:b w:val="false"/>
+                <w:bCs w:val="false"/>
+                <w:color w:val="000000"/>
+                <w:sz w:val="19"/>
+                <w:szCs w:val="19"/>
+              </w:rPr>
+              <w:t xml:space="preserve">Economy</w:t>
+            </w:r>
+          </w:p>
+        </w:tc>
+        <w:tc>
+          <w:tcPr>
+            <w:tcW w:type="dxa" w:w="1700"/>
+            <w:tcMar>
+              <w:top w:type="dxa" w:w="60"/>
+              <w:left w:type="dxa" w:w="100"/>
+              <w:bottom w:type="dxa" w:w="60"/>
+              <w:right w:type="dxa" w:w="100"/>
+            </w:tcMar>
+            <w:vAlign w:val="center"/>
+          </w:tcPr>
+          <w:p>
+            <w:pPr>
+              <w:jc w:val="center"/>
+            </w:pPr>
+            <w:r>
+              <w:rPr>
+                <w:rFonts w:ascii="Calibri" w:cs="Calibri" w:eastAsia="Calibri" w:hAnsi="Calibri"/>
+                <w:b w:val="false"/>
+                <w:bCs w:val="false"/>
+                <w:color w:val="000000"/>
+                <w:sz w:val="19"/>
+                <w:szCs w:val="19"/>
+              </w:rPr>
+              <w:t xml:space="preserve">+0.099 (0.623)</w:t>
+            </w:r>
+          </w:p>
+        </w:tc>
+        <w:tc>
+          <w:tcPr>
+            <w:tcW w:type="dxa" w:w="1300"/>
+            <w:tcMar>
+              <w:top w:type="dxa" w:w="60"/>
+              <w:left w:type="dxa" w:w="100"/>
+              <w:bottom w:type="dxa" w:w="60"/>
+              <w:right w:type="dxa" w:w="100"/>
+            </w:tcMar>
+            <w:vAlign w:val="center"/>
+          </w:tcPr>
+          <w:p>
+            <w:pPr>
+              <w:jc w:val="center"/>
+            </w:pPr>
+            <w:r>
+              <w:rPr>
+                <w:rFonts w:ascii="Calibri" w:cs="Calibri" w:eastAsia="Calibri" w:hAnsi="Calibri"/>
+                <w:b w:val="false"/>
+                <w:bCs w:val="false"/>
+                <w:color w:val="000000"/>
+                <w:sz w:val="19"/>
+                <w:szCs w:val="19"/>
+              </w:rPr>
+              <w:t xml:space="preserve">−129.01</w:t>
+            </w:r>
+          </w:p>
+        </w:tc>
+        <w:tc>
+          <w:tcPr>
+            <w:tcW w:type="dxa" w:w="1400"/>
+            <w:tcMar>
+              <w:top w:type="dxa" w:w="60"/>
+              <w:left w:type="dxa" w:w="100"/>
+              <w:bottom w:type="dxa" w:w="60"/>
+              <w:right w:type="dxa" w:w="100"/>
+            </w:tcMar>
+            <w:vAlign w:val="center"/>
+          </w:tcPr>
+          <w:p>
+            <w:pPr>
+              <w:jc w:val="center"/>
+            </w:pPr>
+            <w:r>
+              <w:rPr>
+                <w:rFonts w:ascii="Calibri" w:cs="Calibri" w:eastAsia="Calibri" w:hAnsi="Calibri"/>
+                <w:b w:val="false"/>
+                <w:bCs w:val="false"/>
+                <w:color w:val="000000"/>
+                <w:sz w:val="19"/>
+                <w:szCs w:val="19"/>
+              </w:rPr>
+              <w:t xml:space="preserve">−127.37</w:t>
+            </w:r>
+          </w:p>
+        </w:tc>
+        <w:tc>
+          <w:tcPr>
+            <w:tcW w:type="dxa" w:w="1780"/>
+            <w:tcMar>
+              <w:top w:type="dxa" w:w="60"/>
+              <w:left w:type="dxa" w:w="100"/>
+              <w:bottom w:type="dxa" w:w="60"/>
+              <w:right w:type="dxa" w:w="100"/>
+            </w:tcMar>
+            <w:vAlign w:val="center"/>
+          </w:tcPr>
+          <w:p>
+            <w:pPr>
+              <w:jc w:val="center"/>
+            </w:pPr>
+            <w:r>
+              <w:rPr>
+                <w:rFonts w:ascii="Calibri" w:cs="Calibri" w:eastAsia="Calibri" w:hAnsi="Calibri"/>
+                <w:b w:val="false"/>
+                <w:bCs w:val="false"/>
+                <w:color w:val="000000"/>
+                <w:sz w:val="19"/>
+                <w:szCs w:val="19"/>
+              </w:rPr>
+              <w:t xml:space="preserve">+1.64</w:t>
+            </w:r>
+          </w:p>
+        </w:tc>
+        <w:tc>
+          <w:tcPr>
+            <w:tcW w:type="dxa" w:w="1700"/>
+            <w:tcMar>
+              <w:top w:type="dxa" w:w="60"/>
+              <w:left w:type="dxa" w:w="100"/>
+              <w:bottom w:type="dxa" w:w="60"/>
+              <w:right w:type="dxa" w:w="100"/>
+            </w:tcMar>
+            <w:vAlign w:val="center"/>
+          </w:tcPr>
+          <w:p>
+            <w:pPr>
+              <w:jc w:val="center"/>
+            </w:pPr>
+            <w:r>
+              <w:rPr>
+                <w:rFonts w:ascii="Calibri" w:cs="Calibri" w:eastAsia="Calibri" w:hAnsi="Calibri"/>
+                <w:b w:val="false"/>
+                <w:bCs w:val="false"/>
+                <w:color w:val="000000"/>
+                <w:sz w:val="19"/>
+                <w:szCs w:val="19"/>
+              </w:rPr>
+              <w:t xml:space="preserve">Static</w:t>
+            </w:r>
+          </w:p>
+        </w:tc>
+      </w:tr>
+      <w:tr>
+        <w:tc>
+          <w:tcPr>
+            <w:tcW w:type="dxa" w:w="1400"/>
+            <w:tcMar>
+              <w:top w:type="dxa" w:w="60"/>
+              <w:left w:type="dxa" w:w="100"/>
+              <w:bottom w:type="dxa" w:w="60"/>
+              <w:right w:type="dxa" w:w="100"/>
+            </w:tcMar>
+            <w:vAlign w:val="center"/>
+          </w:tcPr>
+          <w:p>
+            <w:pPr>
+              <w:jc w:val="left"/>
+            </w:pPr>
+            <w:r>
+              <w:rPr>
+                <w:rFonts w:ascii="Calibri" w:cs="Calibri" w:eastAsia="Calibri" w:hAnsi="Calibri"/>
+                <w:b w:val="false"/>
+                <w:bCs w:val="false"/>
+                <w:color w:val="000000"/>
+                <w:sz w:val="19"/>
+                <w:szCs w:val="19"/>
+              </w:rPr>
+              <w:t xml:space="preserve">1st Class</w:t>
+            </w:r>
+          </w:p>
+        </w:tc>
+        <w:tc>
+          <w:tcPr>
+            <w:tcW w:type="dxa" w:w="1700"/>
+            <w:tcMar>
+              <w:top w:type="dxa" w:w="60"/>
+              <w:left w:type="dxa" w:w="100"/>
+              <w:bottom w:type="dxa" w:w="60"/>
+              <w:right w:type="dxa" w:w="100"/>
+            </w:tcMar>
+            <w:vAlign w:val="center"/>
+          </w:tcPr>
+          <w:p>
+            <w:pPr>
+              <w:jc w:val="center"/>
+            </w:pPr>
+            <w:r>
+              <w:rPr>
+                <w:rFonts w:ascii="Calibri" w:cs="Calibri" w:eastAsia="Calibri" w:hAnsi="Calibri"/>
+                <w:b w:val="false"/>
+                <w:bCs w:val="false"/>
+                <w:color w:val="000000"/>
+                <w:sz w:val="19"/>
+                <w:szCs w:val="19"/>
+              </w:rPr>
+              <w:t xml:space="preserve">+0.281 (0.131)</w:t>
+            </w:r>
+          </w:p>
+        </w:tc>
+        <w:tc>
+          <w:tcPr>
+            <w:tcW w:type="dxa" w:w="1300"/>
+            <w:tcMar>
+              <w:top w:type="dxa" w:w="60"/>
+              <w:left w:type="dxa" w:w="100"/>
+              <w:bottom w:type="dxa" w:w="60"/>
+              <w:right w:type="dxa" w:w="100"/>
+            </w:tcMar>
+            <w:vAlign w:val="center"/>
+          </w:tcPr>
+          <w:p>
+            <w:pPr>
+              <w:jc w:val="center"/>
+            </w:pPr>
+            <w:r>
+              <w:rPr>
+                <w:rFonts w:ascii="Calibri" w:cs="Calibri" w:eastAsia="Calibri" w:hAnsi="Calibri"/>
+                <w:b w:val="false"/>
+                <w:bCs w:val="false"/>
+                <w:color w:val="000000"/>
+                <w:sz w:val="19"/>
+                <w:szCs w:val="19"/>
+              </w:rPr>
+              <w:t xml:space="preserve">−81.39</w:t>
+            </w:r>
+          </w:p>
+        </w:tc>
+        <w:tc>
+          <w:tcPr>
+            <w:tcW w:type="dxa" w:w="1400"/>
+            <w:tcMar>
+              <w:top w:type="dxa" w:w="60"/>
+              <w:left w:type="dxa" w:w="100"/>
+              <w:bottom w:type="dxa" w:w="60"/>
+              <w:right w:type="dxa" w:w="100"/>
+            </w:tcMar>
+            <w:vAlign w:val="center"/>
+          </w:tcPr>
+          <w:p>
+            <w:pPr>
+              <w:jc w:val="center"/>
+            </w:pPr>
+            <w:r>
+              <w:rPr>
+                <w:rFonts w:ascii="Calibri" w:cs="Calibri" w:eastAsia="Calibri" w:hAnsi="Calibri"/>
+                <w:b w:val="false"/>
+                <w:bCs w:val="false"/>
+                <w:color w:val="000000"/>
+                <w:sz w:val="19"/>
+                <w:szCs w:val="19"/>
+              </w:rPr>
+              <w:t xml:space="preserve">−82.79</w:t>
+            </w:r>
+          </w:p>
+        </w:tc>
+        <w:tc>
+          <w:tcPr>
+            <w:tcW w:type="dxa" w:w="1780"/>
+            <w:tcMar>
+              <w:top w:type="dxa" w:w="60"/>
+              <w:left w:type="dxa" w:w="100"/>
+              <w:bottom w:type="dxa" w:w="60"/>
+              <w:right w:type="dxa" w:w="100"/>
+            </w:tcMar>
+            <w:vAlign w:val="center"/>
+          </w:tcPr>
+          <w:p>
+            <w:pPr>
+              <w:jc w:val="center"/>
+            </w:pPr>
+            <w:r>
+              <w:rPr>
+                <w:rFonts w:ascii="Calibri" w:cs="Calibri" w:eastAsia="Calibri" w:hAnsi="Calibri"/>
+                <w:b w:val="false"/>
+                <w:bCs w:val="false"/>
+                <w:color w:val="000000"/>
+                <w:sz w:val="19"/>
+                <w:szCs w:val="19"/>
+              </w:rPr>
+              <w:t xml:space="preserve">−1.40</w:t>
+            </w:r>
+          </w:p>
+        </w:tc>
+        <w:tc>
+          <w:tcPr>
+            <w:tcW w:type="dxa" w:w="1700"/>
+            <w:tcMar>
+              <w:top w:type="dxa" w:w="60"/>
+              <w:left w:type="dxa" w:w="100"/>
+              <w:bottom w:type="dxa" w:w="60"/>
+              <w:right w:type="dxa" w:w="100"/>
+            </w:tcMar>
+            <w:vAlign w:val="center"/>
+          </w:tcPr>
+          <w:p>
+            <w:pPr>
+              <w:jc w:val="center"/>
+            </w:pPr>
+            <w:r>
+              <w:rPr>
+                <w:rFonts w:ascii="Calibri" w:cs="Calibri" w:eastAsia="Calibri" w:hAnsi="Calibri"/>
+                <w:b w:val="false"/>
+                <w:bCs w:val="false"/>
+                <w:color w:val="000000"/>
+                <w:sz w:val="19"/>
+                <w:szCs w:val="19"/>
+              </w:rPr>
+              <w:t xml:space="preserve">Static</w:t>
+            </w:r>
+          </w:p>
+        </w:tc>
+      </w:tr>
+    </w:tbl>
+    <w:p>
+      <w:pPr>
+        <w:spacing w:after="160" w:line="276"/>
+        <w:jc w:val="both"/>
+      </w:pPr>
+      <w:r>
+        <w:rPr>
+          <w:rFonts w:ascii="Calibri" w:cs="Calibri" w:eastAsia="Calibri" w:hAnsi="Calibri"/>
+          <w:sz w:val="21"/>
+          <w:szCs w:val="21"/>
+        </w:rPr>
+        <w:t xml:space="preserve">Static and dynamic refit on the common 35-quarter sample so AIC is directly comparable; ΔAIC &lt; 2 in both cases means the AIC evidence alone is inconclusive.</w:t>
+      </w:r>
+    </w:p>
+    <w:p>
+      <w:pPr>
+        <w:spacing w:after="160" w:line="276"/>
+        <w:jc w:val="both"/>
+      </w:pPr>
+      <w:r>
+        <w:rPr>
+          <w:rFonts w:ascii="Calibri" w:cs="Calibri" w:eastAsia="Calibri" w:hAnsi="Calibri"/>
+          <w:sz w:val="21"/>
+          <w:szCs w:val="21"/>
+        </w:rPr>
+        <w:t xml:space="preserve">Neither class's baseline γ is significant at 5%, so both are assigned the static form. For 1st Class this is a closer call than for Economy: the AIC difference actually favours the dynamic form (by 1.4), but that margin is below the conventional threshold for meaningful evidence and does not override the non-significant t-test on γ. Section 5.1 discusses how sensitive this particular decision is to the fact that γ is tested here while still sharing variance with several collinear regressors.</w:t>
+      </w:r>
+    </w:p>
+    <w:p>
+      <w:pPr>
+        <w:pStyle w:val="Heading2"/>
+        <w:spacing w:after="120" w:before="280"/>
+      </w:pPr>
+      <w:r>
+        <w:rPr>
+          <w:rFonts w:ascii="Calibri" w:cs="Calibri" w:eastAsia="Calibri" w:hAnsi="Calibri"/>
+          <w:b/>
+          <w:bCs/>
+          <w:color w:val="2E5395"/>
+          <w:sz w:val="24"/>
+          <w:szCs w:val="24"/>
+        </w:rPr>
+        <w:t xml:space="preserve">3.3 Variable Selection by Backward Elimination</w:t>
+      </w:r>
+    </w:p>
+    <w:p>
+      <w:pPr>
+        <w:spacing w:after="160" w:line="276"/>
+        <w:jc w:val="both"/>
+      </w:pPr>
+      <w:r>
+        <w:rPr>
+          <w:rFonts w:ascii="Calibri" w:cs="Calibri" w:eastAsia="Calibri" w:hAnsi="Calibri"/>
+          <w:sz w:val="21"/>
+          <w:szCs w:val="21"/>
+        </w:rPr>
+        <w:t xml:space="preserve">Pairwise correlations flag ln(Employment) as the common thread: r = 0.88 with ln(AirFare), 0.77 with ln(GasPrice) and 0.76 with Economy ridership. Variance inflation factors confirm it: ln(Employment) has VIF = 13.4 and ln(Fare_1st) 11.7 in the baseline model, both above the rule-of-thumb limit of 10. Within whichever form Section 3.2 selected, the final variable set and coefficients for each class are obtained by backward elimination on the six candidate economic/service regressors (Fare_econ, Fare_1st, AirFare, GasPrice, Employment, Delays): the single candidate with the highest p-value is dropped and the model refit, repeating until everything left is significant at 5%. Quarter dummies are forced into every model throughout (Section 2.3). Because Section 3.2 assigned both classes the static form, the lag is not a candidate in either run below; had a class been assigned the dynamic form, its lag would instead have been forced into every fit, alongside the seasonal dummies, without being eliminable.</w:t>
       </w:r>
     </w:p>
     <w:tbl>
@@ -2739,8 +3338,8 @@
         </w:tblBorders>
       </w:tblPr>
       <w:tblGrid>
-        <w:gridCol w:w="2500"/>
-        <w:gridCol w:w="4700"/>
+        <w:gridCol w:w="2000"/>
+        <w:gridCol w:w="5200"/>
         <w:gridCol w:w="2880"/>
       </w:tblGrid>
       <w:tr>
@@ -2749,7 +3348,7 @@
         </w:trPr>
         <w:tc>
           <w:tcPr>
-            <w:tcW w:type="dxa" w:w="2500"/>
+            <w:tcW w:type="dxa" w:w="2000"/>
             <w:shd w:fill="1F3864" w:val="clear"/>
             <w:tcMar>
               <w:top w:type="dxa" w:w="60"/>
@@ -2772,13 +3371,13 @@
                 <w:sz w:val="19"/>
                 <w:szCs w:val="19"/>
               </w:rPr>
-              <w:t xml:space="preserve">Run</w:t>
-            </w:r>
-          </w:p>
-        </w:tc>
-        <w:tc>
-          <w:tcPr>
-            <w:tcW w:type="dxa" w:w="4700"/>
+              <w:t xml:space="preserve">Class (form)</w:t>
+            </w:r>
+          </w:p>
+        </w:tc>
+        <w:tc>
+          <w:tcPr>
+            <w:tcW w:type="dxa" w:w="5200"/>
             <w:shd w:fill="1F3864" w:val="clear"/>
             <w:tcMar>
               <w:top w:type="dxa" w:w="60"/>
@@ -2790,7 +3389,7 @@
           </w:tcPr>
           <w:p>
             <w:pPr>
-              <w:jc w:val="left"/>
+              <w:jc w:val="center"/>
             </w:pPr>
             <w:r>
               <w:rPr>
@@ -2819,7 +3418,7 @@
           </w:tcPr>
           <w:p>
             <w:pPr>
-              <w:jc w:val="left"/>
+              <w:jc w:val="center"/>
             </w:pPr>
             <w:r>
               <w:rPr>
@@ -2838,7 +3437,7 @@
       <w:tr>
         <w:tc>
           <w:tcPr>
-            <w:tcW w:type="dxa" w:w="2500"/>
+            <w:tcW w:type="dxa" w:w="2000"/>
             <w:tcMar>
               <w:top w:type="dxa" w:w="60"/>
               <w:left w:type="dxa" w:w="100"/>
@@ -2860,24 +3459,24 @@
                 <w:sz w:val="19"/>
                 <w:szCs w:val="19"/>
               </w:rPr>
-              <w:t xml:space="preserve">Economy — static candidates</w:t>
-            </w:r>
-          </w:p>
-        </w:tc>
-        <w:tc>
-          <w:tcPr>
-            <w:tcW w:type="dxa" w:w="4700"/>
-            <w:tcMar>
-              <w:top w:type="dxa" w:w="60"/>
-              <w:left w:type="dxa" w:w="100"/>
-              <w:bottom w:type="dxa" w:w="60"/>
-              <w:right w:type="dxa" w:w="100"/>
-            </w:tcMar>
-            <w:vAlign w:val="center"/>
-          </w:tcPr>
-          <w:p>
-            <w:pPr>
-              <w:jc w:val="left"/>
+              <w:t xml:space="preserve">Economy (static)</w:t>
+            </w:r>
+          </w:p>
+        </w:tc>
+        <w:tc>
+          <w:tcPr>
+            <w:tcW w:type="dxa" w:w="5200"/>
+            <w:tcMar>
+              <w:top w:type="dxa" w:w="60"/>
+              <w:left w:type="dxa" w:w="100"/>
+              <w:bottom w:type="dxa" w:w="60"/>
+              <w:right w:type="dxa" w:w="100"/>
+            </w:tcMar>
+            <w:vAlign w:val="center"/>
+          </w:tcPr>
+          <w:p>
+            <w:pPr>
+              <w:jc w:val="center"/>
             </w:pPr>
             <w:r>
               <w:rPr>
@@ -2905,7 +3504,7 @@
           </w:tcPr>
           <w:p>
             <w:pPr>
-              <w:jc w:val="left"/>
+              <w:jc w:val="center"/>
             </w:pPr>
             <w:r>
               <w:rPr>
@@ -2924,7 +3523,7 @@
       <w:tr>
         <w:tc>
           <w:tcPr>
-            <w:tcW w:type="dxa" w:w="2500"/>
+            <w:tcW w:type="dxa" w:w="2000"/>
             <w:tcMar>
               <w:top w:type="dxa" w:w="60"/>
               <w:left w:type="dxa" w:w="100"/>
@@ -2946,35 +3545,35 @@
                 <w:sz w:val="19"/>
                 <w:szCs w:val="19"/>
               </w:rPr>
-              <w:t xml:space="preserve">Economy — dynamic candidates (lag included)</w:t>
-            </w:r>
-          </w:p>
-        </w:tc>
-        <w:tc>
-          <w:tcPr>
-            <w:tcW w:type="dxa" w:w="4700"/>
-            <w:tcMar>
-              <w:top w:type="dxa" w:w="60"/>
-              <w:left w:type="dxa" w:w="100"/>
-              <w:bottom w:type="dxa" w:w="60"/>
-              <w:right w:type="dxa" w:w="100"/>
-            </w:tcMar>
-            <w:vAlign w:val="center"/>
-          </w:tcPr>
-          <w:p>
-            <w:pPr>
-              <w:jc w:val="left"/>
-            </w:pPr>
-            <w:r>
-              <w:rPr>
-                <w:rFonts w:ascii="Calibri" w:cs="Calibri" w:eastAsia="Calibri" w:hAnsi="Calibri"/>
-                <w:b w:val="false"/>
-                <w:bCs w:val="false"/>
-                <w:color w:val="000000"/>
-                <w:sz w:val="19"/>
-                <w:szCs w:val="19"/>
-              </w:rPr>
-              <w:t xml:space="preserve">GasPrice (0.661) → Delays (0.612) → Fare_econ (0.688) → Lag (0.519)</w:t>
+              <w:t xml:space="preserve">1st Class (static)</w:t>
+            </w:r>
+          </w:p>
+        </w:tc>
+        <w:tc>
+          <w:tcPr>
+            <w:tcW w:type="dxa" w:w="5200"/>
+            <w:tcMar>
+              <w:top w:type="dxa" w:w="60"/>
+              <w:left w:type="dxa" w:w="100"/>
+              <w:bottom w:type="dxa" w:w="60"/>
+              <w:right w:type="dxa" w:w="100"/>
+            </w:tcMar>
+            <w:vAlign w:val="center"/>
+          </w:tcPr>
+          <w:p>
+            <w:pPr>
+              <w:jc w:val="center"/>
+            </w:pPr>
+            <w:r>
+              <w:rPr>
+                <w:rFonts w:ascii="Calibri" w:cs="Calibri" w:eastAsia="Calibri" w:hAnsi="Calibri"/>
+                <w:b w:val="false"/>
+                <w:bCs w:val="false"/>
+                <w:color w:val="000000"/>
+                <w:sz w:val="19"/>
+                <w:szCs w:val="19"/>
+              </w:rPr>
+              <w:t xml:space="preserve">GasPrice (0.745) → Fare_econ (0.465) → AirFare (0.378) → Delays (0.446) → Employment (0.053)</w:t>
             </w:r>
           </w:p>
         </w:tc>
@@ -2991,93 +3590,7 @@
           </w:tcPr>
           <w:p>
             <w:pPr>
-              <w:jc w:val="left"/>
-            </w:pPr>
-            <w:r>
-              <w:rPr>
-                <w:rFonts w:ascii="Calibri" w:cs="Calibri" w:eastAsia="Calibri" w:hAnsi="Calibri"/>
-                <w:b w:val="false"/>
-                <w:bCs w:val="false"/>
-                <w:color w:val="000000"/>
-                <w:sz w:val="19"/>
-                <w:szCs w:val="19"/>
-              </w:rPr>
-              <w:t xml:space="preserve">Fare_1st, AirFare, Employment (lag eliminated)</w:t>
-            </w:r>
-          </w:p>
-        </w:tc>
-      </w:tr>
-      <w:tr>
-        <w:tc>
-          <w:tcPr>
-            <w:tcW w:type="dxa" w:w="2500"/>
-            <w:tcMar>
-              <w:top w:type="dxa" w:w="60"/>
-              <w:left w:type="dxa" w:w="100"/>
-              <w:bottom w:type="dxa" w:w="60"/>
-              <w:right w:type="dxa" w:w="100"/>
-            </w:tcMar>
-            <w:vAlign w:val="center"/>
-          </w:tcPr>
-          <w:p>
-            <w:pPr>
-              <w:jc w:val="left"/>
-            </w:pPr>
-            <w:r>
-              <w:rPr>
-                <w:rFonts w:ascii="Calibri" w:cs="Calibri" w:eastAsia="Calibri" w:hAnsi="Calibri"/>
-                <w:b w:val="false"/>
-                <w:bCs w:val="false"/>
-                <w:color w:val="000000"/>
-                <w:sz w:val="19"/>
-                <w:szCs w:val="19"/>
-              </w:rPr>
-              <w:t xml:space="preserve">1st Class — static candidates</w:t>
-            </w:r>
-          </w:p>
-        </w:tc>
-        <w:tc>
-          <w:tcPr>
-            <w:tcW w:type="dxa" w:w="4700"/>
-            <w:tcMar>
-              <w:top w:type="dxa" w:w="60"/>
-              <w:left w:type="dxa" w:w="100"/>
-              <w:bottom w:type="dxa" w:w="60"/>
-              <w:right w:type="dxa" w:w="100"/>
-            </w:tcMar>
-            <w:vAlign w:val="center"/>
-          </w:tcPr>
-          <w:p>
-            <w:pPr>
-              <w:jc w:val="left"/>
-            </w:pPr>
-            <w:r>
-              <w:rPr>
-                <w:rFonts w:ascii="Calibri" w:cs="Calibri" w:eastAsia="Calibri" w:hAnsi="Calibri"/>
-                <w:b w:val="false"/>
-                <w:bCs w:val="false"/>
-                <w:color w:val="000000"/>
-                <w:sz w:val="19"/>
-                <w:szCs w:val="19"/>
-              </w:rPr>
-              <w:t xml:space="preserve">GasPrice (0.745) → Fare_econ (0.465) → AirFare (0.378) → Delays (0.446) → Employment (0.053)</w:t>
-            </w:r>
-          </w:p>
-        </w:tc>
-        <w:tc>
-          <w:tcPr>
-            <w:tcW w:type="dxa" w:w="2880"/>
-            <w:tcMar>
-              <w:top w:type="dxa" w:w="60"/>
-              <w:left w:type="dxa" w:w="100"/>
-              <w:bottom w:type="dxa" w:w="60"/>
-              <w:right w:type="dxa" w:w="100"/>
-            </w:tcMar>
-            <w:vAlign w:val="center"/>
-          </w:tcPr>
-          <w:p>
-            <w:pPr>
-              <w:jc w:val="left"/>
+              <w:jc w:val="center"/>
             </w:pPr>
             <w:r>
               <w:rPr>
@@ -3089,92 +3602,6 @@
                 <w:szCs w:val="19"/>
               </w:rPr>
               <w:t xml:space="preserve">Fare_1st</w:t>
-            </w:r>
-          </w:p>
-        </w:tc>
-      </w:tr>
-      <w:tr>
-        <w:tc>
-          <w:tcPr>
-            <w:tcW w:type="dxa" w:w="2500"/>
-            <w:tcMar>
-              <w:top w:type="dxa" w:w="60"/>
-              <w:left w:type="dxa" w:w="100"/>
-              <w:bottom w:type="dxa" w:w="60"/>
-              <w:right w:type="dxa" w:w="100"/>
-            </w:tcMar>
-            <w:vAlign w:val="center"/>
-          </w:tcPr>
-          <w:p>
-            <w:pPr>
-              <w:jc w:val="left"/>
-            </w:pPr>
-            <w:r>
-              <w:rPr>
-                <w:rFonts w:ascii="Calibri" w:cs="Calibri" w:eastAsia="Calibri" w:hAnsi="Calibri"/>
-                <w:b w:val="false"/>
-                <w:bCs w:val="false"/>
-                <w:color w:val="000000"/>
-                <w:sz w:val="19"/>
-                <w:szCs w:val="19"/>
-              </w:rPr>
-              <w:t xml:space="preserve">1st Class — dynamic candidates (lag included)</w:t>
-            </w:r>
-          </w:p>
-        </w:tc>
-        <w:tc>
-          <w:tcPr>
-            <w:tcW w:type="dxa" w:w="4700"/>
-            <w:tcMar>
-              <w:top w:type="dxa" w:w="60"/>
-              <w:left w:type="dxa" w:w="100"/>
-              <w:bottom w:type="dxa" w:w="60"/>
-              <w:right w:type="dxa" w:w="100"/>
-            </w:tcMar>
-            <w:vAlign w:val="center"/>
-          </w:tcPr>
-          <w:p>
-            <w:pPr>
-              <w:jc w:val="left"/>
-            </w:pPr>
-            <w:r>
-              <w:rPr>
-                <w:rFonts w:ascii="Calibri" w:cs="Calibri" w:eastAsia="Calibri" w:hAnsi="Calibri"/>
-                <w:b w:val="false"/>
-                <w:bCs w:val="false"/>
-                <w:color w:val="000000"/>
-                <w:sz w:val="19"/>
-                <w:szCs w:val="19"/>
-              </w:rPr>
-              <w:t xml:space="preserve">GasPrice (0.851) → AirFare (0.636) → Employment (0.496) → Fare_1st (0.249) → Delays (0.216)</w:t>
-            </w:r>
-          </w:p>
-        </w:tc>
-        <w:tc>
-          <w:tcPr>
-            <w:tcW w:type="dxa" w:w="2880"/>
-            <w:tcMar>
-              <w:top w:type="dxa" w:w="60"/>
-              <w:left w:type="dxa" w:w="100"/>
-              <w:bottom w:type="dxa" w:w="60"/>
-              <w:right w:type="dxa" w:w="100"/>
-            </w:tcMar>
-            <w:vAlign w:val="center"/>
-          </w:tcPr>
-          <w:p>
-            <w:pPr>
-              <w:jc w:val="left"/>
-            </w:pPr>
-            <w:r>
-              <w:rPr>
-                <w:rFonts w:ascii="Calibri" w:cs="Calibri" w:eastAsia="Calibri" w:hAnsi="Calibri"/>
-                <w:b w:val="false"/>
-                <w:bCs w:val="false"/>
-                <w:color w:val="000000"/>
-                <w:sz w:val="19"/>
-                <w:szCs w:val="19"/>
-              </w:rPr>
-              <w:t xml:space="preserve">Fare_econ, Lag</w:t>
             </w:r>
           </w:p>
         </w:tc>
@@ -3182,22 +3609,6 @@
     </w:tbl>
     <w:p>
       <w:pPr>
-        <w:spacing w:after="200" w:before="80"/>
-      </w:pPr>
-      <w:r>
-        <w:rPr>
-          <w:rFonts w:ascii="Calibri" w:cs="Calibri" w:eastAsia="Calibri" w:hAnsi="Calibri"/>
-          <w:i/>
-          <w:iCs/>
-          <w:color w:val="595959"/>
-          <w:sz w:val="18"/>
-          <w:szCs w:val="18"/>
-        </w:rPr>
-        <w:t>Each row runs backward elimination independently, from the full candidate list, until every remaining candidate is significant at 5%.</w:t>
-      </w:r>
-    </w:p>
-    <w:p>
-      <w:pPr>
         <w:spacing w:after="160" w:line="276"/>
         <w:jc w:val="both"/>
       </w:pPr>
@@ -3207,21 +3618,7 @@
           <w:sz w:val="21"/>
           <w:szCs w:val="21"/>
         </w:rPr>
-        <w:t>For Economy, both the static and dynamic candidate runs converge on the identical specification {Fare_1st, AirFare, Employment}: the lag is dropped in the dynamic run just as decisively as the other insignificant regressors, so elimination itself rules out habit persistence for this class. For 1st Class the two runs disagree: with no lag available, only the own fare (Fare_1st) survives; once the lag is offered as a candidate, it survives together with the cross fare (Fare_econ), and the own fare is eliminated instead. Section 3.3 compares these two 1st Class outcomes on a common sample to choose the final specification.</w:t>
-      </w:r>
-    </w:p>
-    <w:p>
-      <w:pPr>
-        <w:spacing w:after="160" w:line="276"/>
-        <w:jc w:val="both"/>
-      </w:pPr>
-      <w:r>
-        <w:rPr>
-          <w:rFonts w:ascii="Calibri" w:cs="Calibri" w:eastAsia="Calibri" w:hAnsi="Calibri"/>
-          <w:sz w:val="21"/>
-          <w:szCs w:val="21"/>
-        </w:rPr>
-        <w:t>A useful by-product of elimination is that it resolves the multicollinearity flagged above: Section 3.4 shows every surviving specification has VIF well below 10, even though VIF was never used as an explicit selection rule — the regressors that were highly correlated (GasPrice, and Employment/Fare_1st once the lag is present) were also the ones that failed the significance test and were dropped.</w:t>
+        <w:t xml:space="preserve">Each row runs backward elimination independently, from the full 6-regressor candidate list, until every remaining candidate is significant at 5%.</w:t>
       </w:r>
     </w:p>
     <w:p>
@@ -3238,7 +3635,7 @@
           <w:sz w:val="24"/>
           <w:szCs w:val="24"/>
         </w:rPr>
-        <w:t>3.3 Final Models: Economy and 1st Class</w:t>
+        <w:t xml:space="preserve">3.4 Final Models: Economy and 1st Class</w:t>
       </w:r>
     </w:p>
     <w:p>
@@ -3271,7 +3668,7 @@
           <w:sz w:val="21"/>
           <w:szCs w:val="21"/>
         </w:rPr>
-        <w:t xml:space="preserve">Both backward-elimination candidate sets converge on this specification (Section 3.2), so it is shown once: the static and dynamic runs give identical variables and the lag is not among them.</w:t>
+        <w:t xml:space="preserve">Static model, N = 36.</w:t>
       </w:r>
     </w:p>
     <w:tbl>
@@ -3829,7 +4226,7 @@
           <w:sz w:val="21"/>
           <w:szCs w:val="21"/>
         </w:rPr>
-        <w:t xml:space="preserve">Significance: *** p&lt;0.01, ** p&lt;0.05, * p&lt;0.10. N = 36.</w:t>
+        <w:t xml:space="preserve">Significance: *** p&lt;0.01, ** p&lt;0.05, * p&lt;0.10.</w:t>
       </w:r>
     </w:p>
     <w:p>
@@ -3862,561 +4259,7 @@
           <w:sz w:val="21"/>
           <w:szCs w:val="21"/>
         </w:rPr>
-        <w:t xml:space="preserve">The two candidate sets disagree (Section 3.2). Table 4 compares them on the common 35-quarter sample; Table 5 gives the coefficients of the selected specification.</w:t>
-      </w:r>
-    </w:p>
-    <w:tbl>
-      <w:tblPr>
-        <w:tblW w:type="dxa" w:w="10080"/>
-        <w:tblBorders>
-          <w:top w:val="single" w:color="B7C6E0" w:sz="4"/>
-          <w:left w:val="single" w:color="B7C6E0" w:sz="4"/>
-          <w:bottom w:val="single" w:color="B7C6E0" w:sz="4"/>
-          <w:right w:val="single" w:color="B7C6E0" w:sz="4"/>
-          <w:insideH w:val="single" w:color="B7C6E0" w:sz="2"/>
-          <w:insideV w:val="single" w:color="B7C6E0" w:sz="2"/>
-        </w:tblBorders>
-      </w:tblPr>
-      <w:tblGrid>
-        <w:gridCol w:w="3400"/>
-        <w:gridCol w:w="900"/>
-        <w:gridCol w:w="1300"/>
-        <w:gridCol w:w="1400"/>
-        <w:gridCol w:w="1400"/>
-        <w:gridCol w:w="1680"/>
-      </w:tblGrid>
-      <w:tr>
-        <w:trPr>
-          <w:tblHeader/>
-        </w:trPr>
-        <w:tc>
-          <w:tcPr>
-            <w:tcW w:type="dxa" w:w="3400"/>
-            <w:shd w:fill="1F3864" w:val="clear"/>
-            <w:tcMar>
-              <w:top w:type="dxa" w:w="60"/>
-              <w:left w:type="dxa" w:w="100"/>
-              <w:bottom w:type="dxa" w:w="60"/>
-              <w:right w:type="dxa" w:w="100"/>
-            </w:tcMar>
-            <w:vAlign w:val="center"/>
-          </w:tcPr>
-          <w:p>
-            <w:pPr>
-              <w:jc w:val="left"/>
-            </w:pPr>
-            <w:r>
-              <w:rPr>
-                <w:rFonts w:ascii="Calibri" w:cs="Calibri" w:eastAsia="Calibri" w:hAnsi="Calibri"/>
-                <w:b/>
-                <w:bCs/>
-                <w:color w:val="FFFFFF"/>
-                <w:sz w:val="19"/>
-                <w:szCs w:val="19"/>
-              </w:rPr>
-              <w:t xml:space="preserve">Model</w:t>
-            </w:r>
-          </w:p>
-        </w:tc>
-        <w:tc>
-          <w:tcPr>
-            <w:tcW w:type="dxa" w:w="900"/>
-            <w:shd w:fill="1F3864" w:val="clear"/>
-            <w:tcMar>
-              <w:top w:type="dxa" w:w="60"/>
-              <w:left w:type="dxa" w:w="100"/>
-              <w:bottom w:type="dxa" w:w="60"/>
-              <w:right w:type="dxa" w:w="100"/>
-            </w:tcMar>
-            <w:vAlign w:val="center"/>
-          </w:tcPr>
-          <w:p>
-            <w:pPr>
-              <w:jc w:val="center"/>
-            </w:pPr>
-            <w:r>
-              <w:rPr>
-                <w:rFonts w:ascii="Calibri" w:cs="Calibri" w:eastAsia="Calibri" w:hAnsi="Calibri"/>
-                <w:b/>
-                <w:bCs/>
-                <w:color w:val="FFFFFF"/>
-                <w:sz w:val="19"/>
-                <w:szCs w:val="19"/>
-              </w:rPr>
-              <w:t xml:space="preserve">N</w:t>
-            </w:r>
-          </w:p>
-        </w:tc>
-        <w:tc>
-          <w:tcPr>
-            <w:tcW w:type="dxa" w:w="1300"/>
-            <w:shd w:fill="1F3864" w:val="clear"/>
-            <w:tcMar>
-              <w:top w:type="dxa" w:w="60"/>
-              <w:left w:type="dxa" w:w="100"/>
-              <w:bottom w:type="dxa" w:w="60"/>
-              <w:right w:type="dxa" w:w="100"/>
-            </w:tcMar>
-            <w:vAlign w:val="center"/>
-          </w:tcPr>
-          <w:p>
-            <w:pPr>
-              <w:jc w:val="center"/>
-            </w:pPr>
-            <w:r>
-              <w:rPr>
-                <w:rFonts w:ascii="Calibri" w:cs="Calibri" w:eastAsia="Calibri" w:hAnsi="Calibri"/>
-                <w:b/>
-                <w:bCs/>
-                <w:color w:val="FFFFFF"/>
-                <w:sz w:val="19"/>
-                <w:szCs w:val="19"/>
-              </w:rPr>
-              <w:t xml:space="preserve">Adj. R²</w:t>
-            </w:r>
-          </w:p>
-        </w:tc>
-        <w:tc>
-          <w:tcPr>
-            <w:tcW w:type="dxa" w:w="1400"/>
-            <w:shd w:fill="1F3864" w:val="clear"/>
-            <w:tcMar>
-              <w:top w:type="dxa" w:w="60"/>
-              <w:left w:type="dxa" w:w="100"/>
-              <w:bottom w:type="dxa" w:w="60"/>
-              <w:right w:type="dxa" w:w="100"/>
-            </w:tcMar>
-            <w:vAlign w:val="center"/>
-          </w:tcPr>
-          <w:p>
-            <w:pPr>
-              <w:jc w:val="center"/>
-            </w:pPr>
-            <w:r>
-              <w:rPr>
-                <w:rFonts w:ascii="Calibri" w:cs="Calibri" w:eastAsia="Calibri" w:hAnsi="Calibri"/>
-                <w:b/>
-                <w:bCs/>
-                <w:color w:val="FFFFFF"/>
-                <w:sz w:val="19"/>
-                <w:szCs w:val="19"/>
-              </w:rPr>
-              <w:t xml:space="preserve">AIC</w:t>
-            </w:r>
-          </w:p>
-        </w:tc>
-        <w:tc>
-          <w:tcPr>
-            <w:tcW w:type="dxa" w:w="1400"/>
-            <w:shd w:fill="1F3864" w:val="clear"/>
-            <w:tcMar>
-              <w:top w:type="dxa" w:w="60"/>
-              <w:left w:type="dxa" w:w="100"/>
-              <w:bottom w:type="dxa" w:w="60"/>
-              <w:right w:type="dxa" w:w="100"/>
-            </w:tcMar>
-            <w:vAlign w:val="center"/>
-          </w:tcPr>
-          <w:p>
-            <w:pPr>
-              <w:jc w:val="center"/>
-            </w:pPr>
-            <w:r>
-              <w:rPr>
-                <w:rFonts w:ascii="Calibri" w:cs="Calibri" w:eastAsia="Calibri" w:hAnsi="Calibri"/>
-                <w:b/>
-                <w:bCs/>
-                <w:color w:val="FFFFFF"/>
-                <w:sz w:val="19"/>
-                <w:szCs w:val="19"/>
-              </w:rPr>
-              <w:t xml:space="preserve">BIC</w:t>
-            </w:r>
-          </w:p>
-        </w:tc>
-        <w:tc>
-          <w:tcPr>
-            <w:tcW w:type="dxa" w:w="1680"/>
-            <w:shd w:fill="1F3864" w:val="clear"/>
-            <w:tcMar>
-              <w:top w:type="dxa" w:w="60"/>
-              <w:left w:type="dxa" w:w="100"/>
-              <w:bottom w:type="dxa" w:w="60"/>
-              <w:right w:type="dxa" w:w="100"/>
-            </w:tcMar>
-            <w:vAlign w:val="center"/>
-          </w:tcPr>
-          <w:p>
-            <w:pPr>
-              <w:jc w:val="center"/>
-            </w:pPr>
-            <w:r>
-              <w:rPr>
-                <w:rFonts w:ascii="Calibri" w:cs="Calibri" w:eastAsia="Calibri" w:hAnsi="Calibri"/>
-                <w:b/>
-                <w:bCs/>
-                <w:color w:val="FFFFFF"/>
-                <w:sz w:val="19"/>
-                <w:szCs w:val="19"/>
-              </w:rPr>
-              <w:t xml:space="preserve">DW</w:t>
-            </w:r>
-          </w:p>
-        </w:tc>
-      </w:tr>
-      <w:tr>
-        <w:tc>
-          <w:tcPr>
-            <w:tcW w:type="dxa" w:w="3400"/>
-            <w:tcMar>
-              <w:top w:type="dxa" w:w="60"/>
-              <w:left w:type="dxa" w:w="100"/>
-              <w:bottom w:type="dxa" w:w="60"/>
-              <w:right w:type="dxa" w:w="100"/>
-            </w:tcMar>
-            <w:vAlign w:val="center"/>
-          </w:tcPr>
-          <w:p>
-            <w:pPr>
-              <w:jc w:val="left"/>
-            </w:pPr>
-            <w:r>
-              <w:rPr>
-                <w:rFonts w:ascii="Calibri" w:cs="Calibri" w:eastAsia="Calibri" w:hAnsi="Calibri"/>
-                <w:b w:val="false"/>
-                <w:bCs w:val="false"/>
-                <w:color w:val="000000"/>
-                <w:sz w:val="19"/>
-                <w:szCs w:val="19"/>
-              </w:rPr>
-              <w:t xml:space="preserve">Static-elimination (Fare_1st only)</w:t>
-            </w:r>
-          </w:p>
-        </w:tc>
-        <w:tc>
-          <w:tcPr>
-            <w:tcW w:type="dxa" w:w="900"/>
-            <w:tcMar>
-              <w:top w:type="dxa" w:w="60"/>
-              <w:left w:type="dxa" w:w="100"/>
-              <w:bottom w:type="dxa" w:w="60"/>
-              <w:right w:type="dxa" w:w="100"/>
-            </w:tcMar>
-            <w:vAlign w:val="center"/>
-          </w:tcPr>
-          <w:p>
-            <w:pPr>
-              <w:jc w:val="center"/>
-            </w:pPr>
-            <w:r>
-              <w:rPr>
-                <w:rFonts w:ascii="Calibri" w:cs="Calibri" w:eastAsia="Calibri" w:hAnsi="Calibri"/>
-                <w:b w:val="false"/>
-                <w:bCs w:val="false"/>
-                <w:color w:val="000000"/>
-                <w:sz w:val="19"/>
-                <w:szCs w:val="19"/>
-              </w:rPr>
-              <w:t xml:space="preserve">35</w:t>
-            </w:r>
-          </w:p>
-        </w:tc>
-        <w:tc>
-          <w:tcPr>
-            <w:tcW w:type="dxa" w:w="1300"/>
-            <w:tcMar>
-              <w:top w:type="dxa" w:w="60"/>
-              <w:left w:type="dxa" w:w="100"/>
-              <w:bottom w:type="dxa" w:w="60"/>
-              <w:right w:type="dxa" w:w="100"/>
-            </w:tcMar>
-            <w:vAlign w:val="center"/>
-          </w:tcPr>
-          <w:p>
-            <w:pPr>
-              <w:jc w:val="center"/>
-            </w:pPr>
-            <w:r>
-              <w:rPr>
-                <w:rFonts w:ascii="Calibri" w:cs="Calibri" w:eastAsia="Calibri" w:hAnsi="Calibri"/>
-                <w:b w:val="false"/>
-                <w:bCs w:val="false"/>
-                <w:color w:val="000000"/>
-                <w:sz w:val="19"/>
-                <w:szCs w:val="19"/>
-              </w:rPr>
-              <w:t xml:space="preserve">0.818</w:t>
-            </w:r>
-          </w:p>
-        </w:tc>
-        <w:tc>
-          <w:tcPr>
-            <w:tcW w:type="dxa" w:w="1400"/>
-            <w:tcMar>
-              <w:top w:type="dxa" w:w="60"/>
-              <w:left w:type="dxa" w:w="100"/>
-              <w:bottom w:type="dxa" w:w="60"/>
-              <w:right w:type="dxa" w:w="100"/>
-            </w:tcMar>
-            <w:vAlign w:val="center"/>
-          </w:tcPr>
-          <w:p>
-            <w:pPr>
-              <w:jc w:val="center"/>
-            </w:pPr>
-            <w:r>
-              <w:rPr>
-                <w:rFonts w:ascii="Calibri" w:cs="Calibri" w:eastAsia="Calibri" w:hAnsi="Calibri"/>
-                <w:b w:val="false"/>
-                <w:bCs w:val="false"/>
-                <w:color w:val="000000"/>
-                <w:sz w:val="19"/>
-                <w:szCs w:val="19"/>
-              </w:rPr>
-              <w:t xml:space="preserve">−84.21</w:t>
-            </w:r>
-          </w:p>
-        </w:tc>
-        <w:tc>
-          <w:tcPr>
-            <w:tcW w:type="dxa" w:w="1400"/>
-            <w:tcMar>
-              <w:top w:type="dxa" w:w="60"/>
-              <w:left w:type="dxa" w:w="100"/>
-              <w:bottom w:type="dxa" w:w="60"/>
-              <w:right w:type="dxa" w:w="100"/>
-            </w:tcMar>
-            <w:vAlign w:val="center"/>
-          </w:tcPr>
-          <w:p>
-            <w:pPr>
-              <w:jc w:val="center"/>
-            </w:pPr>
-            <w:r>
-              <w:rPr>
-                <w:rFonts w:ascii="Calibri" w:cs="Calibri" w:eastAsia="Calibri" w:hAnsi="Calibri"/>
-                <w:b w:val="false"/>
-                <w:bCs w:val="false"/>
-                <w:color w:val="000000"/>
-                <w:sz w:val="19"/>
-                <w:szCs w:val="19"/>
-              </w:rPr>
-              <w:t xml:space="preserve">−76.44</w:t>
-            </w:r>
-          </w:p>
-        </w:tc>
-        <w:tc>
-          <w:tcPr>
-            <w:tcW w:type="dxa" w:w="1680"/>
-            <w:tcMar>
-              <w:top w:type="dxa" w:w="60"/>
-              <w:left w:type="dxa" w:w="100"/>
-              <w:bottom w:type="dxa" w:w="60"/>
-              <w:right w:type="dxa" w:w="100"/>
-            </w:tcMar>
-            <w:vAlign w:val="center"/>
-          </w:tcPr>
-          <w:p>
-            <w:pPr>
-              <w:jc w:val="center"/>
-            </w:pPr>
-            <w:r>
-              <w:rPr>
-                <w:rFonts w:ascii="Calibri" w:cs="Calibri" w:eastAsia="Calibri" w:hAnsi="Calibri"/>
-                <w:b w:val="false"/>
-                <w:bCs w:val="false"/>
-                <w:color w:val="000000"/>
-                <w:sz w:val="19"/>
-                <w:szCs w:val="19"/>
-              </w:rPr>
-              <w:t xml:space="preserve">1.22</w:t>
-            </w:r>
-          </w:p>
-        </w:tc>
-      </w:tr>
-      <w:tr>
-        <w:tc>
-          <w:tcPr>
-            <w:tcW w:type="dxa" w:w="3400"/>
-            <w:tcMar>
-              <w:top w:type="dxa" w:w="60"/>
-              <w:left w:type="dxa" w:w="100"/>
-              <w:bottom w:type="dxa" w:w="60"/>
-              <w:right w:type="dxa" w:w="100"/>
-            </w:tcMar>
-            <w:vAlign w:val="center"/>
-          </w:tcPr>
-          <w:p>
-            <w:pPr>
-              <w:jc w:val="left"/>
-            </w:pPr>
-            <w:r>
-              <w:rPr>
-                <w:rFonts w:ascii="Calibri" w:cs="Calibri" w:eastAsia="Calibri" w:hAnsi="Calibri"/>
-                <w:b w:val="false"/>
-                <w:bCs w:val="false"/>
-                <w:color w:val="000000"/>
-                <w:sz w:val="19"/>
-                <w:szCs w:val="19"/>
-              </w:rPr>
-              <w:t xml:space="preserve">Dynamic-elimination (Fare_econ + lag)</w:t>
-            </w:r>
-          </w:p>
-        </w:tc>
-        <w:tc>
-          <w:tcPr>
-            <w:tcW w:type="dxa" w:w="900"/>
-            <w:tcMar>
-              <w:top w:type="dxa" w:w="60"/>
-              <w:left w:type="dxa" w:w="100"/>
-              <w:bottom w:type="dxa" w:w="60"/>
-              <w:right w:type="dxa" w:w="100"/>
-            </w:tcMar>
-            <w:vAlign w:val="center"/>
-          </w:tcPr>
-          <w:p>
-            <w:pPr>
-              <w:jc w:val="center"/>
-            </w:pPr>
-            <w:r>
-              <w:rPr>
-                <w:rFonts w:ascii="Calibri" w:cs="Calibri" w:eastAsia="Calibri" w:hAnsi="Calibri"/>
-                <w:b w:val="false"/>
-                <w:bCs w:val="false"/>
-                <w:color w:val="000000"/>
-                <w:sz w:val="19"/>
-                <w:szCs w:val="19"/>
-              </w:rPr>
-              <w:t xml:space="preserve">35</w:t>
-            </w:r>
-          </w:p>
-        </w:tc>
-        <w:tc>
-          <w:tcPr>
-            <w:tcW w:type="dxa" w:w="1300"/>
-            <w:tcMar>
-              <w:top w:type="dxa" w:w="60"/>
-              <w:left w:type="dxa" w:w="100"/>
-              <w:bottom w:type="dxa" w:w="60"/>
-              <w:right w:type="dxa" w:w="100"/>
-            </w:tcMar>
-            <w:vAlign w:val="center"/>
-          </w:tcPr>
-          <w:p>
-            <w:pPr>
-              <w:jc w:val="center"/>
-            </w:pPr>
-            <w:r>
-              <w:rPr>
-                <w:rFonts w:ascii="Calibri" w:cs="Calibri" w:eastAsia="Calibri" w:hAnsi="Calibri"/>
-                <w:b w:val="false"/>
-                <w:bCs w:val="false"/>
-                <w:color w:val="000000"/>
-                <w:sz w:val="19"/>
-                <w:szCs w:val="19"/>
-              </w:rPr>
-              <w:t xml:space="preserve">0.841</w:t>
-            </w:r>
-          </w:p>
-        </w:tc>
-        <w:tc>
-          <w:tcPr>
-            <w:tcW w:type="dxa" w:w="1400"/>
-            <w:tcMar>
-              <w:top w:type="dxa" w:w="60"/>
-              <w:left w:type="dxa" w:w="100"/>
-              <w:bottom w:type="dxa" w:w="60"/>
-              <w:right w:type="dxa" w:w="100"/>
-            </w:tcMar>
-            <w:vAlign w:val="center"/>
-          </w:tcPr>
-          <w:p>
-            <w:pPr>
-              <w:jc w:val="center"/>
-            </w:pPr>
-            <w:r>
-              <w:rPr>
-                <w:rFonts w:ascii="Calibri" w:cs="Calibri" w:eastAsia="Calibri" w:hAnsi="Calibri"/>
-                <w:b w:val="false"/>
-                <w:bCs w:val="false"/>
-                <w:color w:val="000000"/>
-                <w:sz w:val="19"/>
-                <w:szCs w:val="19"/>
-              </w:rPr>
-              <w:t xml:space="preserve">−88.08</w:t>
-            </w:r>
-          </w:p>
-        </w:tc>
-        <w:tc>
-          <w:tcPr>
-            <w:tcW w:type="dxa" w:w="1400"/>
-            <w:tcMar>
-              <w:top w:type="dxa" w:w="60"/>
-              <w:left w:type="dxa" w:w="100"/>
-              <w:bottom w:type="dxa" w:w="60"/>
-              <w:right w:type="dxa" w:w="100"/>
-            </w:tcMar>
-            <w:vAlign w:val="center"/>
-          </w:tcPr>
-          <w:p>
-            <w:pPr>
-              <w:jc w:val="center"/>
-            </w:pPr>
-            <w:r>
-              <w:rPr>
-                <w:rFonts w:ascii="Calibri" w:cs="Calibri" w:eastAsia="Calibri" w:hAnsi="Calibri"/>
-                <w:b w:val="false"/>
-                <w:bCs w:val="false"/>
-                <w:color w:val="000000"/>
-                <w:sz w:val="19"/>
-                <w:szCs w:val="19"/>
-              </w:rPr>
-              <w:t xml:space="preserve">−78.75</w:t>
-            </w:r>
-          </w:p>
-        </w:tc>
-        <w:tc>
-          <w:tcPr>
-            <w:tcW w:type="dxa" w:w="1680"/>
-            <w:tcMar>
-              <w:top w:type="dxa" w:w="60"/>
-              <w:left w:type="dxa" w:w="100"/>
-              <w:bottom w:type="dxa" w:w="60"/>
-              <w:right w:type="dxa" w:w="100"/>
-            </w:tcMar>
-            <w:vAlign w:val="center"/>
-          </w:tcPr>
-          <w:p>
-            <w:pPr>
-              <w:jc w:val="center"/>
-            </w:pPr>
-            <w:r>
-              <w:rPr>
-                <w:rFonts w:ascii="Calibri" w:cs="Calibri" w:eastAsia="Calibri" w:hAnsi="Calibri"/>
-                <w:b w:val="false"/>
-                <w:bCs w:val="false"/>
-                <w:color w:val="000000"/>
-                <w:sz w:val="19"/>
-                <w:szCs w:val="19"/>
-              </w:rPr>
-              <w:t xml:space="preserve">1.83</w:t>
-            </w:r>
-          </w:p>
-        </w:tc>
-      </w:tr>
-    </w:tbl>
-    <w:p>
-      <w:pPr>
-        <w:spacing w:after="160" w:line="276"/>
-        <w:jc w:val="both"/>
-      </w:pPr>
-      <w:r>
-        <w:rPr>
-          <w:rFonts w:ascii="Calibri" w:cs="Calibri" w:eastAsia="Calibri" w:hAnsi="Calibri"/>
-          <w:sz w:val="21"/>
-          <w:szCs w:val="21"/>
-        </w:rPr>
-        <w:t xml:space="preserve">Both refit on the common 35-quarter sample so AIC/BIC/DW are directly comparable; lower AIC/BIC and DW closer to 2 are better. The dynamic-elimination model wins on every criterion and is selected as the 1st Class final model.</w:t>
+        <w:t xml:space="preserve">Static model, N = 36. Own fare is the only regressor to survive elimination (Table 2); its coefficient is positive, which is discussed in Section 4.3.</w:t>
       </w:r>
     </w:p>
     <w:tbl>
@@ -4523,7 +4366,7 @@
                 <w:sz w:val="19"/>
                 <w:szCs w:val="19"/>
               </w:rPr>
-              <w:t xml:space="preserve">ln(Fare_econ) — cross fare</w:t>
+              <w:t xml:space="preserve">ln(Fare_1st) — own fare</w:t>
             </w:r>
           </w:p>
         </w:tc>
@@ -4551,7 +4394,7 @@
                 <w:sz w:val="19"/>
                 <w:szCs w:val="19"/>
               </w:rPr>
-              <w:t xml:space="preserve">+1.098 (0.006) ***</w:t>
+              <w:t xml:space="preserve">+1.128 (&lt;0.001) ***</w:t>
             </w:r>
           </w:p>
         </w:tc>
@@ -4581,7 +4424,7 @@
                 <w:sz w:val="19"/>
                 <w:szCs w:val="19"/>
               </w:rPr>
-              <w:t xml:space="preserve">Lagged ridership γ</w:t>
+              <w:t xml:space="preserve">Q2 (vs Q1)</w:t>
             </w:r>
           </w:p>
         </w:tc>
@@ -4609,7 +4452,7 @@
                 <w:sz w:val="19"/>
                 <w:szCs w:val="19"/>
               </w:rPr>
-              <w:t xml:space="preserve">+0.455 (0.002) ***</w:t>
+              <w:t xml:space="preserve">−9.6% (0.004) ***</w:t>
             </w:r>
           </w:p>
         </w:tc>
@@ -4639,7 +4482,7 @@
                 <w:sz w:val="19"/>
                 <w:szCs w:val="19"/>
               </w:rPr>
-              <w:t xml:space="preserve">Q2 (vs Q1)</w:t>
+              <w:t xml:space="preserve">Q3 (vs Q1)</w:t>
             </w:r>
           </w:p>
         </w:tc>
@@ -4667,7 +4510,7 @@
                 <w:sz w:val="19"/>
                 <w:szCs w:val="19"/>
               </w:rPr>
-              <w:t xml:space="preserve">−7.0% (0.037) **</w:t>
+              <w:t xml:space="preserve">−18.0% (&lt;0.001) ***</w:t>
             </w:r>
           </w:p>
         </w:tc>
@@ -4697,7 +4540,7 @@
                 <w:sz w:val="19"/>
                 <w:szCs w:val="19"/>
               </w:rPr>
-              <w:t xml:space="preserve">Q3 (vs Q1)</w:t>
+              <w:t xml:space="preserve">Q4 (vs Q1)</w:t>
             </w:r>
           </w:p>
         </w:tc>
@@ -4725,7 +4568,7 @@
                 <w:sz w:val="19"/>
                 <w:szCs w:val="19"/>
               </w:rPr>
-              <w:t xml:space="preserve">−16.1% (&lt;0.001) ***</w:t>
+              <w:t xml:space="preserve">+9.3% (0.008) ***</w:t>
             </w:r>
           </w:p>
         </w:tc>
@@ -4755,7 +4598,7 @@
                 <w:sz w:val="19"/>
                 <w:szCs w:val="19"/>
               </w:rPr>
-              <w:t xml:space="preserve">Q4 (vs Q1)</w:t>
+              <w:t xml:space="preserve">Adj. R² / AIC / BIC</w:t>
             </w:r>
           </w:p>
         </w:tc>
@@ -4783,7 +4626,7 @@
                 <w:sz w:val="19"/>
                 <w:szCs w:val="19"/>
               </w:rPr>
-              <w:t xml:space="preserve">+23.3% (0.001) ***</w:t>
+              <w:t xml:space="preserve">0.816 / −87.40 / −79.48</w:t>
             </w:r>
           </w:p>
         </w:tc>
@@ -4813,7 +4656,7 @@
                 <w:sz w:val="19"/>
                 <w:szCs w:val="19"/>
               </w:rPr>
-              <w:t xml:space="preserve">Adj. R² / AIC / BIC</w:t>
+              <w:t xml:space="preserve">Durbin-Watson</w:t>
             </w:r>
           </w:p>
         </w:tc>
@@ -4841,65 +4684,7 @@
                 <w:sz w:val="19"/>
                 <w:szCs w:val="19"/>
               </w:rPr>
-              <w:t xml:space="preserve">0.841 / −88.08 / −78.75</w:t>
-            </w:r>
-          </w:p>
-        </w:tc>
-      </w:tr>
-      <w:tr>
-        <w:tc>
-          <w:tcPr>
-            <w:tcW w:type="dxa" w:w="5040"/>
-            <w:tcMar>
-              <w:top w:type="dxa" w:w="60"/>
-              <w:left w:type="dxa" w:w="100"/>
-              <w:bottom w:type="dxa" w:w="60"/>
-              <w:right w:type="dxa" w:w="100"/>
-            </w:tcMar>
-            <w:vAlign w:val="center"/>
-          </w:tcPr>
-          <w:p>
-            <w:pPr>
-              <w:jc w:val="left"/>
-            </w:pPr>
-            <w:r>
-              <w:rPr>
-                <w:rFonts w:ascii="Calibri" w:cs="Calibri" w:eastAsia="Calibri" w:hAnsi="Calibri"/>
-                <w:b w:val="false"/>
-                <w:bCs w:val="false"/>
-                <w:color w:val="000000"/>
-                <w:sz w:val="19"/>
-                <w:szCs w:val="19"/>
-              </w:rPr>
-              <w:t xml:space="preserve">Durbin-Watson (Durbin's h)</w:t>
-            </w:r>
-          </w:p>
-        </w:tc>
-        <w:tc>
-          <w:tcPr>
-            <w:tcW w:type="dxa" w:w="5040"/>
-            <w:tcMar>
-              <w:top w:type="dxa" w:w="60"/>
-              <w:left w:type="dxa" w:w="100"/>
-              <w:bottom w:type="dxa" w:w="60"/>
-              <w:right w:type="dxa" w:w="100"/>
-            </w:tcMar>
-            <w:vAlign w:val="center"/>
-          </w:tcPr>
-          <w:p>
-            <w:pPr>
-              <w:jc w:val="center"/>
-            </w:pPr>
-            <w:r>
-              <w:rPr>
-                <w:rFonts w:ascii="Calibri" w:cs="Calibri" w:eastAsia="Calibri" w:hAnsi="Calibri"/>
-                <w:b w:val="false"/>
-                <w:bCs w:val="false"/>
-                <w:color w:val="000000"/>
-                <w:sz w:val="19"/>
-                <w:szCs w:val="19"/>
-              </w:rPr>
-              <w:t xml:space="preserve">1.83 (h = 0.84)</w:t>
+              <w:t xml:space="preserve">1.20</w:t>
             </w:r>
           </w:p>
         </w:tc>
@@ -4916,7 +4701,7 @@
           <w:sz w:val="21"/>
           <w:szCs w:val="21"/>
         </w:rPr>
-        <w:t xml:space="preserve">Significance: *** p&lt;0.01, ** p&lt;0.05, * p&lt;0.10. N = 35.</w:t>
+        <w:t xml:space="preserve">Significance: *** p&lt;0.01, ** p&lt;0.05, * p&lt;0.10.</w:t>
       </w:r>
     </w:p>
     <w:p>
@@ -4933,7 +4718,7 @@
           <w:sz w:val="24"/>
           <w:szCs w:val="24"/>
         </w:rPr>
-        <w:t>3.4 Diagnostics of the Final Models</w:t>
+        <w:t xml:space="preserve">3.5 Diagnostics of the Final Models</w:t>
       </w:r>
     </w:p>
     <w:p>
@@ -4947,76 +4732,8 @@
           <w:sz w:val="21"/>
           <w:szCs w:val="21"/>
         </w:rPr>
-        <w:t>Every final specification has low VIF: the Economy final model's maximum is 5.2 (ln(Employment)); the 1st Class static-elimination model has only one regressor besides the seasonal dummies (VIF = 1.2); and the 1st Class dynamic-elimination (final) model has a maximum of 5.6 (the Q4 dummy), with the lag term itself at 3.7. All are comfortably below the threshold of 10, confirming Section 3.2's point that elimination resolved the baseline's multicollinearity as a by-product. For residual autocorrelation, the Economy final model is clean (Durbin-Watson = 2.07). For 1st Class, the static-elimination model has DW = 1.22 on the common 35-quarter sample, indicating positive residual autocorrelation (its standard errors are too small and t-statistics too optimistic); the final dynamic model lifts DW to 1.83 and, since n·se(γ)² is below 1 in this specification, Durbin's h is defined and equal to 0.84 — comfortably inside the |h| &lt; 1.96 range consistent with no residual autocorrelation. The lag term therefore corrects a genuine specification problem, not just a diagnostic nicety.</w:t>
-      </w:r>
-    </w:p>
-    <w:p>
-      <w:pPr>
-        <w:pStyle w:val="Heading2"/>
-        <w:spacing w:after="120" w:before="280"/>
-      </w:pPr>
-      <w:r>
-        <w:rPr>
-          <w:rFonts w:ascii="Calibri" w:cs="Calibri" w:eastAsia="Calibri" w:hAnsi="Calibri"/>
-          <w:b/>
-          <w:bCs/>
-          <w:color w:val="2E5395"/>
-          <w:sz w:val="24"/>
-          <w:szCs w:val="24"/>
-        </w:rPr>
-        <w:t xml:space="preserve">3.5 Final Model Selection</w:t>
-      </w:r>
-    </w:p>
-    <w:p>
-      <w:pPr>
-        <w:spacing w:after="160" w:line="276"/>
-        <w:jc w:val="both"/>
-      </w:pPr>
-      <w:r>
-        <w:rPr>
-          <w:rFonts w:ascii="Calibri" w:cs="Calibri" w:eastAsia="Calibri" w:hAnsi="Calibri"/>
-          <w:sz w:val="21"/>
-          <w:szCs w:val="21"/>
-        </w:rPr>
-        <w:t>Because backward elimination is run separately with and without the lag available (Section 3.2), the final specification per class follows directly from what survives, rather than from a separate static-versus-dynamic comparison of one fixed regressor list.</w:t>
-      </w:r>
-    </w:p>
-    <w:p>
-      <w:pPr>
-        <w:spacing w:after="160" w:line="276"/>
-        <w:jc w:val="both"/>
-      </w:pPr>
-      <w:r>
-        <w:rPr>
-          <w:rFonts w:ascii="Calibri" w:cs="Calibri" w:eastAsia="Calibri" w:hAnsi="Calibri"/>
-          <w:b/>
-          <w:bCs/>
-          <w:sz w:val="21"/>
-          <w:szCs w:val="21"/>
-        </w:rPr>
-        <w:t>Economy — final model: static. Both the static- and dynamic-candidate elimination runs converge on the identical specification {Fare_1st, AirFare, Employment}, and the lag term is dropped in the dynamic run as decisively as any other insignificant regressor (p = 0.52). There is no statistical support for lagged demand in this segment: Economy ridership adjusts to changing conditions essentially within the quarter.</w:t>
-      </w:r>
-    </w:p>
-    <w:p>
-      <w:pPr>
-        <w:spacing w:after="160" w:line="276"/>
-        <w:jc w:val="both"/>
-      </w:pPr>
-      <w:r>
-        <w:rPr>
-          <w:rFonts w:ascii="Calibri" w:cs="Calibri" w:eastAsia="Calibri" w:hAnsi="Calibri"/>
-          <w:b/>
-          <w:bCs/>
-          <w:sz w:val="21"/>
-          <w:szCs w:val="21"/>
-        </w:rPr>
-        <w:t>1st Class — final model: dynamic. Unlike Economy, the two candidate sets select different regressors (Table 2), so the choice is made by comparing both resulting models on the common 35-quarter sample (Table 4). The dynamic-elimination model wins decisively: lower AIC (−88.1 vs −84.2) and BIC (−78.8 vs −76.4), higher adjusted R² (0.841 vs 0.818), and it removes the positive residual autocorrelation present in the static-elimination model (DW 1.22 → 1.83, Durbin's h = 0.84). The lag coefficient itself is significant at 5% (γ = 0.455, p = 0.002), so — in contrast to a judgement call based on a marginal AIC difference — this is a comparatively firm result for a report of this size.</w:t>
-      </w:r>
-    </w:p>
-    <w:p>
-      <w:pPr>
-        <w:pageBreakBefore/>
-      </w:pPr>
+        <w:t xml:space="preserve">Both final models have low VIF: Economy's maximum is 5.2 (ln(Employment)); 1st Class has only one regressor besides the seasonal dummies, so its VIF is a trivial 1.2. Residual autocorrelation differs between the two: the Economy model is clean (Durbin-Watson = 2.07), but the 1st Class model shows positive residual autocorrelation (DW = 1.20), meaning its standard errors are likely too small and its own-fare t-statistic too optimistic. A lagged-demand term would ordinarily be the natural fix for this kind of autocorrelation, but Section 3.2 already ruled it out for this class before elimination began; Section 5.1 returns to this point.</w:t>
+      </w:r>
     </w:p>
     <w:p>
       <w:pPr>
@@ -6119,7 +5836,7 @@
           <w:sz w:val="24"/>
           <w:szCs w:val="24"/>
         </w:rPr>
-        <w:t>4.2 1st Class (final dynamic model, γ = 0.455)</w:t>
+        <w:t>4.2 1st Class (final model)</w:t>
       </w:r>
     </w:p>
     <w:p>
@@ -6133,12 +5850,12 @@
           <w:sz w:val="21"/>
           <w:szCs w:val="21"/>
         </w:rPr>
-        <w:t>For the dynamic model, the short-run elasticity is the estimated coefficient and the long-run elasticity — the eventual effect once ridership has fully adjusted — is the coefficient divided by (1 − 0.455) = 0.545, i.e. about 1.8 times larger.</w:t>
+        <w:t xml:space="preserve">Own fare is the only regressor to survive elimination for this class (Section 3.3); its coefficient is significantly positive, which Section 4.3 discusses.</w:t>
       </w:r>
     </w:p>
     <w:tbl>
       <w:tblPr>
-        <w:tblW w:type="dxa" w:w="9680"/>
+        <w:tblW w:type="dxa" w:w="10180"/>
         <w:tblBorders>
           <w:top w:val="single" w:color="B7C6E0" w:sz="4"/>
           <w:left w:val="single" w:color="B7C6E0" w:sz="4"/>
@@ -6149,11 +5866,11 @@
         </w:tblBorders>
       </w:tblPr>
       <w:tblGrid>
-        <w:gridCol w:w="2400"/>
-        <w:gridCol w:w="1600"/>
-        <w:gridCol w:w="1600"/>
-        <w:gridCol w:w="1200"/>
-        <w:gridCol w:w="2880"/>
+        <w:gridCol w:w="1900"/>
+        <w:gridCol w:w="1000"/>
+        <w:gridCol w:w="900"/>
+        <w:gridCol w:w="1300"/>
+        <w:gridCol w:w="5080"/>
       </w:tblGrid>
       <w:tr>
         <w:trPr>
@@ -6161,7 +5878,7 @@
         </w:trPr>
         <w:tc>
           <w:tcPr>
-            <w:tcW w:type="dxa" w:w="2400"/>
+            <w:tcW w:type="dxa" w:w="1900"/>
             <w:shd w:fill="1F3864" w:val="clear"/>
             <w:tcMar>
               <w:top w:type="dxa" w:w="60"/>
@@ -6190,7 +5907,7 @@
         </w:tc>
         <w:tc>
           <w:tcPr>
-            <w:tcW w:type="dxa" w:w="1600"/>
+            <w:tcW w:type="dxa" w:w="1000"/>
             <w:shd w:fill="1F3864" w:val="clear"/>
             <w:tcMar>
               <w:top w:type="dxa" w:w="60"/>
@@ -6213,13 +5930,13 @@
                 <w:sz w:val="19"/>
                 <w:szCs w:val="19"/>
               </w:rPr>
-              <w:t xml:space="preserve">Short-run</w:t>
-            </w:r>
-          </w:p>
-        </w:tc>
-        <w:tc>
-          <w:tcPr>
-            <w:tcW w:type="dxa" w:w="1600"/>
+              <w:t xml:space="preserve">Elasticity</w:t>
+            </w:r>
+          </w:p>
+        </w:tc>
+        <w:tc>
+          <w:tcPr>
+            <w:tcW w:type="dxa" w:w="900"/>
             <w:shd w:fill="1F3864" w:val="clear"/>
             <w:tcMar>
               <w:top w:type="dxa" w:w="60"/>
@@ -6242,13 +5959,13 @@
                 <w:sz w:val="19"/>
                 <w:szCs w:val="19"/>
               </w:rPr>
-              <w:t xml:space="preserve">Long-run</w:t>
-            </w:r>
-          </w:p>
-        </w:tc>
-        <w:tc>
-          <w:tcPr>
-            <w:tcW w:type="dxa" w:w="1200"/>
+              <w:t xml:space="preserve">p-value</w:t>
+            </w:r>
+          </w:p>
+        </w:tc>
+        <w:tc>
+          <w:tcPr>
+            <w:tcW w:type="dxa" w:w="1300"/>
             <w:shd w:fill="1F3864" w:val="clear"/>
             <w:tcMar>
               <w:top w:type="dxa" w:w="60"/>
@@ -6271,13 +5988,13 @@
                 <w:sz w:val="19"/>
                 <w:szCs w:val="19"/>
               </w:rPr>
-              <w:t xml:space="preserve">p-value</w:t>
-            </w:r>
-          </w:p>
-        </w:tc>
-        <w:tc>
-          <w:tcPr>
-            <w:tcW w:type="dxa" w:w="2880"/>
+              <w:t xml:space="preserve">Result</w:t>
+            </w:r>
+          </w:p>
+        </w:tc>
+        <w:tc>
+          <w:tcPr>
+            <w:tcW w:type="dxa" w:w="5080"/>
             <w:shd w:fill="1F3864" w:val="clear"/>
             <w:tcMar>
               <w:top w:type="dxa" w:w="60"/>
@@ -6289,7 +6006,7 @@
           </w:tcPr>
           <w:p>
             <w:pPr>
-              <w:jc w:val="center"/>
+              <w:jc w:val="left"/>
             </w:pPr>
             <w:r>
               <w:rPr>
@@ -6300,7 +6017,7 @@
                 <w:sz w:val="19"/>
                 <w:szCs w:val="19"/>
               </w:rPr>
-              <w:t xml:space="preserve">Result</w:t>
+              <w:t xml:space="preserve">Interpretation</w:t>
             </w:r>
           </w:p>
         </w:tc>
@@ -6308,7 +6025,7 @@
       <w:tr>
         <w:tc>
           <w:tcPr>
-            <w:tcW w:type="dxa" w:w="2400"/>
+            <w:tcW w:type="dxa" w:w="1900"/>
             <w:tcMar>
               <w:top w:type="dxa" w:w="60"/>
               <w:left w:type="dxa" w:w="100"/>
@@ -6330,97 +6047,69 @@
                 <w:sz w:val="19"/>
                 <w:szCs w:val="19"/>
               </w:rPr>
-              <w:t xml:space="preserve">Cross fare (Fare_econ)</w:t>
-            </w:r>
-          </w:p>
-        </w:tc>
-        <w:tc>
-          <w:tcPr>
-            <w:tcW w:type="dxa" w:w="1600"/>
-            <w:tcMar>
-              <w:top w:type="dxa" w:w="60"/>
-              <w:left w:type="dxa" w:w="100"/>
-              <w:bottom w:type="dxa" w:w="60"/>
-              <w:right w:type="dxa" w:w="100"/>
-            </w:tcMar>
-            <w:vAlign w:val="center"/>
-          </w:tcPr>
-          <w:p>
-            <w:pPr>
-              <w:jc w:val="center"/>
-            </w:pPr>
-            <w:r>
-              <w:rPr>
-                <w:rFonts w:ascii="Calibri" w:cs="Calibri" w:eastAsia="Calibri" w:hAnsi="Calibri"/>
-                <w:b w:val="false"/>
-                <w:bCs w:val="false"/>
-                <w:color w:val="000000"/>
-                <w:sz w:val="19"/>
-                <w:szCs w:val="19"/>
-              </w:rPr>
-              <w:t xml:space="preserve">+1.10</w:t>
-            </w:r>
-          </w:p>
-        </w:tc>
-        <w:tc>
-          <w:tcPr>
-            <w:tcW w:type="dxa" w:w="1600"/>
-            <w:tcMar>
-              <w:top w:type="dxa" w:w="60"/>
-              <w:left w:type="dxa" w:w="100"/>
-              <w:bottom w:type="dxa" w:w="60"/>
-              <w:right w:type="dxa" w:w="100"/>
-            </w:tcMar>
-            <w:vAlign w:val="center"/>
-          </w:tcPr>
-          <w:p>
-            <w:pPr>
-              <w:jc w:val="center"/>
-            </w:pPr>
-            <w:r>
-              <w:rPr>
-                <w:rFonts w:ascii="Calibri" w:cs="Calibri" w:eastAsia="Calibri" w:hAnsi="Calibri"/>
-                <w:b w:val="false"/>
-                <w:bCs w:val="false"/>
-                <w:color w:val="000000"/>
-                <w:sz w:val="19"/>
-                <w:szCs w:val="19"/>
-              </w:rPr>
-              <w:t xml:space="preserve">+2.01</w:t>
-            </w:r>
-          </w:p>
-        </w:tc>
-        <w:tc>
-          <w:tcPr>
-            <w:tcW w:type="dxa" w:w="1200"/>
-            <w:tcMar>
-              <w:top w:type="dxa" w:w="60"/>
-              <w:left w:type="dxa" w:w="100"/>
-              <w:bottom w:type="dxa" w:w="60"/>
-              <w:right w:type="dxa" w:w="100"/>
-            </w:tcMar>
-            <w:vAlign w:val="center"/>
-          </w:tcPr>
-          <w:p>
-            <w:pPr>
-              <w:jc w:val="center"/>
-            </w:pPr>
-            <w:r>
-              <w:rPr>
-                <w:rFonts w:ascii="Calibri" w:cs="Calibri" w:eastAsia="Calibri" w:hAnsi="Calibri"/>
-                <w:b w:val="false"/>
-                <w:bCs w:val="false"/>
-                <w:color w:val="000000"/>
-                <w:sz w:val="19"/>
-                <w:szCs w:val="19"/>
-              </w:rPr>
-              <w:t xml:space="preserve">0.006</w:t>
-            </w:r>
-          </w:p>
-        </w:tc>
-        <w:tc>
-          <w:tcPr>
-            <w:tcW w:type="dxa" w:w="2880"/>
+              <w:t xml:space="preserve">Own fare</w:t>
+            </w:r>
+          </w:p>
+        </w:tc>
+        <w:tc>
+          <w:tcPr>
+            <w:tcW w:type="dxa" w:w="1000"/>
+            <w:tcMar>
+              <w:top w:type="dxa" w:w="60"/>
+              <w:left w:type="dxa" w:w="100"/>
+              <w:bottom w:type="dxa" w:w="60"/>
+              <w:right w:type="dxa" w:w="100"/>
+            </w:tcMar>
+            <w:vAlign w:val="center"/>
+          </w:tcPr>
+          <w:p>
+            <w:pPr>
+              <w:jc w:val="center"/>
+            </w:pPr>
+            <w:r>
+              <w:rPr>
+                <w:rFonts w:ascii="Calibri" w:cs="Calibri" w:eastAsia="Calibri" w:hAnsi="Calibri"/>
+                <w:b w:val="false"/>
+                <w:bCs w:val="false"/>
+                <w:color w:val="000000"/>
+                <w:sz w:val="19"/>
+                <w:szCs w:val="19"/>
+              </w:rPr>
+              <w:t xml:space="preserve">+1.13</w:t>
+            </w:r>
+          </w:p>
+        </w:tc>
+        <w:tc>
+          <w:tcPr>
+            <w:tcW w:type="dxa" w:w="900"/>
+            <w:tcMar>
+              <w:top w:type="dxa" w:w="60"/>
+              <w:left w:type="dxa" w:w="100"/>
+              <w:bottom w:type="dxa" w:w="60"/>
+              <w:right w:type="dxa" w:w="100"/>
+            </w:tcMar>
+            <w:vAlign w:val="center"/>
+          </w:tcPr>
+          <w:p>
+            <w:pPr>
+              <w:jc w:val="center"/>
+            </w:pPr>
+            <w:r>
+              <w:rPr>
+                <w:rFonts w:ascii="Calibri" w:cs="Calibri" w:eastAsia="Calibri" w:hAnsi="Calibri"/>
+                <w:b w:val="false"/>
+                <w:bCs w:val="false"/>
+                <w:color w:val="000000"/>
+                <w:sz w:val="19"/>
+                <w:szCs w:val="19"/>
+              </w:rPr>
+              <w:t xml:space="preserve">&lt;0.001</w:t>
+            </w:r>
+          </w:p>
+        </w:tc>
+        <w:tc>
+          <w:tcPr>
+            <w:tcW w:type="dxa" w:w="1300"/>
             <w:tcMar>
               <w:top w:type="dxa" w:w="60"/>
               <w:left w:type="dxa" w:w="100"/>
@@ -6443,6 +6132,34 @@
                 <w:szCs w:val="19"/>
               </w:rPr>
               <w:t xml:space="preserve">Significant</w:t>
+            </w:r>
+          </w:p>
+        </w:tc>
+        <w:tc>
+          <w:tcPr>
+            <w:tcW w:type="dxa" w:w="5080"/>
+            <w:tcMar>
+              <w:top w:type="dxa" w:w="60"/>
+              <w:left w:type="dxa" w:w="100"/>
+              <w:bottom w:type="dxa" w:w="60"/>
+              <w:right w:type="dxa" w:w="100"/>
+            </w:tcMar>
+            <w:vAlign w:val="center"/>
+          </w:tcPr>
+          <w:p>
+            <w:pPr>
+              <w:jc w:val="left"/>
+            </w:pPr>
+            <w:r>
+              <w:rPr>
+                <w:rFonts w:ascii="Calibri" w:cs="Calibri" w:eastAsia="Calibri" w:hAnsi="Calibri"/>
+                <w:b w:val="false"/>
+                <w:bCs w:val="false"/>
+                <w:color w:val="000000"/>
+                <w:sz w:val="19"/>
+                <w:szCs w:val="19"/>
+              </w:rPr>
+              <w:t xml:space="preserve">Positive — the wrong sign for a genuine demand curve: a 10% higher own fare is associated with about 11% higher 1st Class ridership. See Section 4.3.</w:t>
             </w:r>
           </w:p>
         </w:tc>
@@ -6450,7 +6167,7 @@
       <w:tr>
         <w:tc>
           <w:tcPr>
-            <w:tcW w:type="dxa" w:w="2400"/>
+            <w:tcW w:type="dxa" w:w="1900"/>
             <w:tcMar>
               <w:top w:type="dxa" w:w="60"/>
               <w:left w:type="dxa" w:w="100"/>
@@ -6478,91 +6195,63 @@
         </w:tc>
         <w:tc>
           <w:tcPr>
-            <w:tcW w:type="dxa" w:w="1600"/>
-            <w:tcMar>
-              <w:top w:type="dxa" w:w="60"/>
-              <w:left w:type="dxa" w:w="100"/>
-              <w:bottom w:type="dxa" w:w="60"/>
-              <w:right w:type="dxa" w:w="100"/>
-            </w:tcMar>
-            <w:vAlign w:val="center"/>
-          </w:tcPr>
-          <w:p>
-            <w:pPr>
-              <w:jc w:val="center"/>
-            </w:pPr>
-            <w:r>
-              <w:rPr>
-                <w:rFonts w:ascii="Calibri" w:cs="Calibri" w:eastAsia="Calibri" w:hAnsi="Calibri"/>
-                <w:b w:val="false"/>
-                <w:bCs w:val="false"/>
-                <w:color w:val="000000"/>
-                <w:sz w:val="19"/>
-                <w:szCs w:val="19"/>
-              </w:rPr>
-              <w:t xml:space="preserve">−7.0%</w:t>
-            </w:r>
-          </w:p>
-        </w:tc>
-        <w:tc>
-          <w:tcPr>
-            <w:tcW w:type="dxa" w:w="1600"/>
-            <w:tcMar>
-              <w:top w:type="dxa" w:w="60"/>
-              <w:left w:type="dxa" w:w="100"/>
-              <w:bottom w:type="dxa" w:w="60"/>
-              <w:right w:type="dxa" w:w="100"/>
-            </w:tcMar>
-            <w:vAlign w:val="center"/>
-          </w:tcPr>
-          <w:p>
-            <w:pPr>
-              <w:jc w:val="center"/>
-            </w:pPr>
-            <w:r>
-              <w:rPr>
-                <w:rFonts w:ascii="Calibri" w:cs="Calibri" w:eastAsia="Calibri" w:hAnsi="Calibri"/>
-                <w:b w:val="false"/>
-                <w:bCs w:val="false"/>
-                <w:color w:val="000000"/>
-                <w:sz w:val="19"/>
-                <w:szCs w:val="19"/>
-              </w:rPr>
-              <w:t xml:space="preserve">—</w:t>
-            </w:r>
-          </w:p>
-        </w:tc>
-        <w:tc>
-          <w:tcPr>
-            <w:tcW w:type="dxa" w:w="1200"/>
-            <w:tcMar>
-              <w:top w:type="dxa" w:w="60"/>
-              <w:left w:type="dxa" w:w="100"/>
-              <w:bottom w:type="dxa" w:w="60"/>
-              <w:right w:type="dxa" w:w="100"/>
-            </w:tcMar>
-            <w:vAlign w:val="center"/>
-          </w:tcPr>
-          <w:p>
-            <w:pPr>
-              <w:jc w:val="center"/>
-            </w:pPr>
-            <w:r>
-              <w:rPr>
-                <w:rFonts w:ascii="Calibri" w:cs="Calibri" w:eastAsia="Calibri" w:hAnsi="Calibri"/>
-                <w:b w:val="false"/>
-                <w:bCs w:val="false"/>
-                <w:color w:val="000000"/>
-                <w:sz w:val="19"/>
-                <w:szCs w:val="19"/>
-              </w:rPr>
-              <w:t xml:space="preserve">0.037</w:t>
-            </w:r>
-          </w:p>
-        </w:tc>
-        <w:tc>
-          <w:tcPr>
-            <w:tcW w:type="dxa" w:w="2880"/>
+            <w:tcW w:type="dxa" w:w="1000"/>
+            <w:tcMar>
+              <w:top w:type="dxa" w:w="60"/>
+              <w:left w:type="dxa" w:w="100"/>
+              <w:bottom w:type="dxa" w:w="60"/>
+              <w:right w:type="dxa" w:w="100"/>
+            </w:tcMar>
+            <w:vAlign w:val="center"/>
+          </w:tcPr>
+          <w:p>
+            <w:pPr>
+              <w:jc w:val="center"/>
+            </w:pPr>
+            <w:r>
+              <w:rPr>
+                <w:rFonts w:ascii="Calibri" w:cs="Calibri" w:eastAsia="Calibri" w:hAnsi="Calibri"/>
+                <w:b w:val="false"/>
+                <w:bCs w:val="false"/>
+                <w:color w:val="000000"/>
+                <w:sz w:val="19"/>
+                <w:szCs w:val="19"/>
+              </w:rPr>
+              <w:t xml:space="preserve">−9.6%</w:t>
+            </w:r>
+          </w:p>
+        </w:tc>
+        <w:tc>
+          <w:tcPr>
+            <w:tcW w:type="dxa" w:w="900"/>
+            <w:tcMar>
+              <w:top w:type="dxa" w:w="60"/>
+              <w:left w:type="dxa" w:w="100"/>
+              <w:bottom w:type="dxa" w:w="60"/>
+              <w:right w:type="dxa" w:w="100"/>
+            </w:tcMar>
+            <w:vAlign w:val="center"/>
+          </w:tcPr>
+          <w:p>
+            <w:pPr>
+              <w:jc w:val="center"/>
+            </w:pPr>
+            <w:r>
+              <w:rPr>
+                <w:rFonts w:ascii="Calibri" w:cs="Calibri" w:eastAsia="Calibri" w:hAnsi="Calibri"/>
+                <w:b w:val="false"/>
+                <w:bCs w:val="false"/>
+                <w:color w:val="000000"/>
+                <w:sz w:val="19"/>
+                <w:szCs w:val="19"/>
+              </w:rPr>
+              <w:t xml:space="preserve">0.004</w:t>
+            </w:r>
+          </w:p>
+        </w:tc>
+        <w:tc>
+          <w:tcPr>
+            <w:tcW w:type="dxa" w:w="1300"/>
             <w:tcMar>
               <w:top w:type="dxa" w:w="60"/>
               <w:left w:type="dxa" w:w="100"/>
@@ -6585,6 +6274,34 @@
                 <w:szCs w:val="19"/>
               </w:rPr>
               <w:t xml:space="preserve">Significant</w:t>
+            </w:r>
+          </w:p>
+        </w:tc>
+        <w:tc>
+          <w:tcPr>
+            <w:tcW w:type="dxa" w:w="5080"/>
+            <w:tcMar>
+              <w:top w:type="dxa" w:w="60"/>
+              <w:left w:type="dxa" w:w="100"/>
+              <w:bottom w:type="dxa" w:w="60"/>
+              <w:right w:type="dxa" w:w="100"/>
+            </w:tcMar>
+            <w:vAlign w:val="center"/>
+          </w:tcPr>
+          <w:p>
+            <w:pPr>
+              <w:jc w:val="left"/>
+            </w:pPr>
+            <w:r>
+              <w:rPr>
+                <w:rFonts w:ascii="Calibri" w:cs="Calibri" w:eastAsia="Calibri" w:hAnsi="Calibri"/>
+                <w:b w:val="false"/>
+                <w:bCs w:val="false"/>
+                <w:color w:val="000000"/>
+                <w:sz w:val="19"/>
+                <w:szCs w:val="19"/>
+              </w:rPr>
+              <w:t xml:space="preserve">Seasonal low.</w:t>
             </w:r>
           </w:p>
         </w:tc>
@@ -6592,7 +6309,7 @@
       <w:tr>
         <w:tc>
           <w:tcPr>
-            <w:tcW w:type="dxa" w:w="2400"/>
+            <w:tcW w:type="dxa" w:w="1900"/>
             <w:tcMar>
               <w:top w:type="dxa" w:w="60"/>
               <w:left w:type="dxa" w:w="100"/>
@@ -6620,63 +6337,35 @@
         </w:tc>
         <w:tc>
           <w:tcPr>
-            <w:tcW w:type="dxa" w:w="1600"/>
-            <w:tcMar>
-              <w:top w:type="dxa" w:w="60"/>
-              <w:left w:type="dxa" w:w="100"/>
-              <w:bottom w:type="dxa" w:w="60"/>
-              <w:right w:type="dxa" w:w="100"/>
-            </w:tcMar>
-            <w:vAlign w:val="center"/>
-          </w:tcPr>
-          <w:p>
-            <w:pPr>
-              <w:jc w:val="center"/>
-            </w:pPr>
-            <w:r>
-              <w:rPr>
-                <w:rFonts w:ascii="Calibri" w:cs="Calibri" w:eastAsia="Calibri" w:hAnsi="Calibri"/>
-                <w:b w:val="false"/>
-                <w:bCs w:val="false"/>
-                <w:color w:val="000000"/>
-                <w:sz w:val="19"/>
-                <w:szCs w:val="19"/>
-              </w:rPr>
-              <w:t xml:space="preserve">−16.1%</w:t>
-            </w:r>
-          </w:p>
-        </w:tc>
-        <w:tc>
-          <w:tcPr>
-            <w:tcW w:type="dxa" w:w="1600"/>
-            <w:tcMar>
-              <w:top w:type="dxa" w:w="60"/>
-              <w:left w:type="dxa" w:w="100"/>
-              <w:bottom w:type="dxa" w:w="60"/>
-              <w:right w:type="dxa" w:w="100"/>
-            </w:tcMar>
-            <w:vAlign w:val="center"/>
-          </w:tcPr>
-          <w:p>
-            <w:pPr>
-              <w:jc w:val="center"/>
-            </w:pPr>
-            <w:r>
-              <w:rPr>
-                <w:rFonts w:ascii="Calibri" w:cs="Calibri" w:eastAsia="Calibri" w:hAnsi="Calibri"/>
-                <w:b w:val="false"/>
-                <w:bCs w:val="false"/>
-                <w:color w:val="000000"/>
-                <w:sz w:val="19"/>
-                <w:szCs w:val="19"/>
-              </w:rPr>
-              <w:t xml:space="preserve">—</w:t>
-            </w:r>
-          </w:p>
-        </w:tc>
-        <w:tc>
-          <w:tcPr>
-            <w:tcW w:type="dxa" w:w="1200"/>
+            <w:tcW w:type="dxa" w:w="1000"/>
+            <w:tcMar>
+              <w:top w:type="dxa" w:w="60"/>
+              <w:left w:type="dxa" w:w="100"/>
+              <w:bottom w:type="dxa" w:w="60"/>
+              <w:right w:type="dxa" w:w="100"/>
+            </w:tcMar>
+            <w:vAlign w:val="center"/>
+          </w:tcPr>
+          <w:p>
+            <w:pPr>
+              <w:jc w:val="center"/>
+            </w:pPr>
+            <w:r>
+              <w:rPr>
+                <w:rFonts w:ascii="Calibri" w:cs="Calibri" w:eastAsia="Calibri" w:hAnsi="Calibri"/>
+                <w:b w:val="false"/>
+                <w:bCs w:val="false"/>
+                <w:color w:val="000000"/>
+                <w:sz w:val="19"/>
+                <w:szCs w:val="19"/>
+              </w:rPr>
+              <w:t xml:space="preserve">−18.0%</w:t>
+            </w:r>
+          </w:p>
+        </w:tc>
+        <w:tc>
+          <w:tcPr>
+            <w:tcW w:type="dxa" w:w="900"/>
             <w:tcMar>
               <w:top w:type="dxa" w:w="60"/>
               <w:left w:type="dxa" w:w="100"/>
@@ -6704,7 +6393,7 @@
         </w:tc>
         <w:tc>
           <w:tcPr>
-            <w:tcW w:type="dxa" w:w="2880"/>
+            <w:tcW w:type="dxa" w:w="1300"/>
             <w:tcMar>
               <w:top w:type="dxa" w:w="60"/>
               <w:left w:type="dxa" w:w="100"/>
@@ -6727,6 +6416,34 @@
                 <w:szCs w:val="19"/>
               </w:rPr>
               <w:t xml:space="preserve">Significant</w:t>
+            </w:r>
+          </w:p>
+        </w:tc>
+        <w:tc>
+          <w:tcPr>
+            <w:tcW w:type="dxa" w:w="5080"/>
+            <w:tcMar>
+              <w:top w:type="dxa" w:w="60"/>
+              <w:left w:type="dxa" w:w="100"/>
+              <w:bottom w:type="dxa" w:w="60"/>
+              <w:right w:type="dxa" w:w="100"/>
+            </w:tcMar>
+            <w:vAlign w:val="center"/>
+          </w:tcPr>
+          <w:p>
+            <w:pPr>
+              <w:jc w:val="left"/>
+            </w:pPr>
+            <w:r>
+              <w:rPr>
+                <w:rFonts w:ascii="Calibri" w:cs="Calibri" w:eastAsia="Calibri" w:hAnsi="Calibri"/>
+                <w:b w:val="false"/>
+                <w:bCs w:val="false"/>
+                <w:color w:val="000000"/>
+                <w:sz w:val="19"/>
+                <w:szCs w:val="19"/>
+              </w:rPr>
+              <w:t xml:space="preserve">Deepest seasonal trough.</w:t>
             </w:r>
           </w:p>
         </w:tc>
@@ -6734,7 +6451,7 @@
       <w:tr>
         <w:tc>
           <w:tcPr>
-            <w:tcW w:type="dxa" w:w="2400"/>
+            <w:tcW w:type="dxa" w:w="1900"/>
             <w:tcMar>
               <w:top w:type="dxa" w:w="60"/>
               <w:left w:type="dxa" w:w="100"/>
@@ -6762,91 +6479,63 @@
         </w:tc>
         <w:tc>
           <w:tcPr>
-            <w:tcW w:type="dxa" w:w="1600"/>
-            <w:tcMar>
-              <w:top w:type="dxa" w:w="60"/>
-              <w:left w:type="dxa" w:w="100"/>
-              <w:bottom w:type="dxa" w:w="60"/>
-              <w:right w:type="dxa" w:w="100"/>
-            </w:tcMar>
-            <w:vAlign w:val="center"/>
-          </w:tcPr>
-          <w:p>
-            <w:pPr>
-              <w:jc w:val="center"/>
-            </w:pPr>
-            <w:r>
-              <w:rPr>
-                <w:rFonts w:ascii="Calibri" w:cs="Calibri" w:eastAsia="Calibri" w:hAnsi="Calibri"/>
-                <w:b w:val="false"/>
-                <w:bCs w:val="false"/>
-                <w:color w:val="000000"/>
-                <w:sz w:val="19"/>
-                <w:szCs w:val="19"/>
-              </w:rPr>
-              <w:t xml:space="preserve">+23.3%</w:t>
-            </w:r>
-          </w:p>
-        </w:tc>
-        <w:tc>
-          <w:tcPr>
-            <w:tcW w:type="dxa" w:w="1600"/>
-            <w:tcMar>
-              <w:top w:type="dxa" w:w="60"/>
-              <w:left w:type="dxa" w:w="100"/>
-              <w:bottom w:type="dxa" w:w="60"/>
-              <w:right w:type="dxa" w:w="100"/>
-            </w:tcMar>
-            <w:vAlign w:val="center"/>
-          </w:tcPr>
-          <w:p>
-            <w:pPr>
-              <w:jc w:val="center"/>
-            </w:pPr>
-            <w:r>
-              <w:rPr>
-                <w:rFonts w:ascii="Calibri" w:cs="Calibri" w:eastAsia="Calibri" w:hAnsi="Calibri"/>
-                <w:b w:val="false"/>
-                <w:bCs w:val="false"/>
-                <w:color w:val="000000"/>
-                <w:sz w:val="19"/>
-                <w:szCs w:val="19"/>
-              </w:rPr>
-              <w:t xml:space="preserve">—</w:t>
-            </w:r>
-          </w:p>
-        </w:tc>
-        <w:tc>
-          <w:tcPr>
-            <w:tcW w:type="dxa" w:w="1200"/>
-            <w:tcMar>
-              <w:top w:type="dxa" w:w="60"/>
-              <w:left w:type="dxa" w:w="100"/>
-              <w:bottom w:type="dxa" w:w="60"/>
-              <w:right w:type="dxa" w:w="100"/>
-            </w:tcMar>
-            <w:vAlign w:val="center"/>
-          </w:tcPr>
-          <w:p>
-            <w:pPr>
-              <w:jc w:val="center"/>
-            </w:pPr>
-            <w:r>
-              <w:rPr>
-                <w:rFonts w:ascii="Calibri" w:cs="Calibri" w:eastAsia="Calibri" w:hAnsi="Calibri"/>
-                <w:b w:val="false"/>
-                <w:bCs w:val="false"/>
-                <w:color w:val="000000"/>
-                <w:sz w:val="19"/>
-                <w:szCs w:val="19"/>
-              </w:rPr>
-              <w:t xml:space="preserve">0.001</w:t>
-            </w:r>
-          </w:p>
-        </w:tc>
-        <w:tc>
-          <w:tcPr>
-            <w:tcW w:type="dxa" w:w="2880"/>
+            <w:tcW w:type="dxa" w:w="1000"/>
+            <w:tcMar>
+              <w:top w:type="dxa" w:w="60"/>
+              <w:left w:type="dxa" w:w="100"/>
+              <w:bottom w:type="dxa" w:w="60"/>
+              <w:right w:type="dxa" w:w="100"/>
+            </w:tcMar>
+            <w:vAlign w:val="center"/>
+          </w:tcPr>
+          <w:p>
+            <w:pPr>
+              <w:jc w:val="center"/>
+            </w:pPr>
+            <w:r>
+              <w:rPr>
+                <w:rFonts w:ascii="Calibri" w:cs="Calibri" w:eastAsia="Calibri" w:hAnsi="Calibri"/>
+                <w:b w:val="false"/>
+                <w:bCs w:val="false"/>
+                <w:color w:val="000000"/>
+                <w:sz w:val="19"/>
+                <w:szCs w:val="19"/>
+              </w:rPr>
+              <w:t xml:space="preserve">+9.3%</w:t>
+            </w:r>
+          </w:p>
+        </w:tc>
+        <w:tc>
+          <w:tcPr>
+            <w:tcW w:type="dxa" w:w="900"/>
+            <w:tcMar>
+              <w:top w:type="dxa" w:w="60"/>
+              <w:left w:type="dxa" w:w="100"/>
+              <w:bottom w:type="dxa" w:w="60"/>
+              <w:right w:type="dxa" w:w="100"/>
+            </w:tcMar>
+            <w:vAlign w:val="center"/>
+          </w:tcPr>
+          <w:p>
+            <w:pPr>
+              <w:jc w:val="center"/>
+            </w:pPr>
+            <w:r>
+              <w:rPr>
+                <w:rFonts w:ascii="Calibri" w:cs="Calibri" w:eastAsia="Calibri" w:hAnsi="Calibri"/>
+                <w:b w:val="false"/>
+                <w:bCs w:val="false"/>
+                <w:color w:val="000000"/>
+                <w:sz w:val="19"/>
+                <w:szCs w:val="19"/>
+              </w:rPr>
+              <w:t xml:space="preserve">0.008</w:t>
+            </w:r>
+          </w:p>
+        </w:tc>
+        <w:tc>
+          <w:tcPr>
+            <w:tcW w:type="dxa" w:w="1300"/>
             <w:tcMar>
               <w:top w:type="dxa" w:w="60"/>
               <w:left w:type="dxa" w:w="100"/>
@@ -6869,41 +6558,39 @@
                 <w:szCs w:val="19"/>
               </w:rPr>
               <w:t xml:space="preserve">Significant</w:t>
+            </w:r>
+          </w:p>
+        </w:tc>
+        <w:tc>
+          <w:tcPr>
+            <w:tcW w:type="dxa" w:w="5080"/>
+            <w:tcMar>
+              <w:top w:type="dxa" w:w="60"/>
+              <w:left w:type="dxa" w:w="100"/>
+              <w:bottom w:type="dxa" w:w="60"/>
+              <w:right w:type="dxa" w:w="100"/>
+            </w:tcMar>
+            <w:vAlign w:val="center"/>
+          </w:tcPr>
+          <w:p>
+            <w:pPr>
+              <w:jc w:val="left"/>
+            </w:pPr>
+            <w:r>
+              <w:rPr>
+                <w:rFonts w:ascii="Calibri" w:cs="Calibri" w:eastAsia="Calibri" w:hAnsi="Calibri"/>
+                <w:b w:val="false"/>
+                <w:bCs w:val="false"/>
+                <w:color w:val="000000"/>
+                <w:sz w:val="19"/>
+                <w:szCs w:val="19"/>
+              </w:rPr>
+              <w:t xml:space="preserve">Seasonal peak; peak-to-trough (Q3→Q4) about +33%.</w:t>
             </w:r>
           </w:p>
         </w:tc>
       </w:tr>
     </w:tbl>
-    <w:p>
-      <w:pPr>
-        <w:spacing w:after="200" w:before="80"/>
-      </w:pPr>
-      <w:r>
-        <w:rPr>
-          <w:rFonts w:ascii="Calibri" w:cs="Calibri" w:eastAsia="Calibri" w:hAnsi="Calibri"/>
-          <w:i/>
-          <w:iCs/>
-          <w:color w:val="595959"/>
-          <w:sz w:val="18"/>
-          <w:szCs w:val="18"/>
-        </w:rPr>
-        <w:t>Seasonal effects are shown as short-run percentage differences; long-run scaling is not applied to dummies. Own fare, air fare, gas price, regional employment and delays are all eliminated for 1st Class once the lag is allowed to compete for the same variance (Section 3.2) and are therefore absent from the final model.</w:t>
-      </w:r>
-    </w:p>
-    <w:p>
-      <w:pPr>
-        <w:spacing w:after="160" w:before="160"/>
-        <w:jc w:val="both"/>
-      </w:pPr>
-      <w:r>
-        <w:rPr>
-          <w:rFonts w:ascii="Calibri" w:cs="Calibri" w:eastAsia="Calibri" w:hAnsi="Calibri"/>
-          <w:sz w:val="21"/>
-          <w:szCs w:val="21"/>
-        </w:rPr>
-        <w:t>Only the cross fare and lagged demand survive as economic drivers, together with strong seasonality. A 10% rise in Economy's fare is associated with roughly 11% higher 1st Class ridership in the short run and about 20% in the long run — consistent with the two classes being substitutes, seen from the 1st Class side. 1st Class is also far more seasonal than Economy: model-implied ridership is about 47% higher in Q4 than in Q3, versus roughly 20% between Economy's trough (Q2) and peak (Q4) — more than twice the swing.</w:t>
-      </w:r>
-    </w:p>
     <w:p>
       <w:pPr>
         <w:pStyle w:val="Heading2"/>
@@ -6932,7 +6619,7 @@
           <w:sz w:val="21"/>
           <w:szCs w:val="21"/>
         </w:rPr>
-        <w:t>Own fare does not survive backward elimination in either final model — a first, purely statistical resolution of the puzzle a fixed-specification approach would have produced. The underlying pattern is still informative, though. In the 1st Class static-candidate run (Section 3.2), before the lag was allowed to compete, own fare (Fare_1st) was the single surviving regressor, with a significant positive coefficient (+1.13, p = 0.048) — the wrong sign for a genuine demand curve. Once the lag is offered as a candidate, that apparent own-fare effect disappears entirely and is replaced by cross fare and lagged demand instead. This is consistent with the earlier positive own-fare estimate having largely been a proxy for persistence (fares and ridership both trend together over time) rather than a real price effect — resolved here by modelling the dynamics explicitly, not by removing regressors for collinearity.</w:t>
+        <w:t>Both final models show a wrong-signed price coefficient, but for different variables. For 1st Class, own fare is the only regressor to survive elimination, with a significant positive coefficient (+1.13, p &lt; 0.001) — higher fares associated with higher ridership, the opposite of standard demand theory. Multicollinearity is an unlikely explanation: its VIF is a trivial 1.2, and it is the sole non-seasonal regressor in the model, so there is nothing left for it to be collinear with. A more probable cause is price endogeneity: average fare per km can rise because demand is high (through yield management or peak pricing), so the regression partly captures demand pushing fares up rather than fares pushing demand down.</w:t>
       </w:r>
     </w:p>
     <w:p>
@@ -6946,7 +6633,7 @@
           <w:sz w:val="21"/>
           <w:szCs w:val="21"/>
         </w:rPr>
-        <w:t xml:space="preserve">The remaining sign anomaly is Economy's cross-fare elasticity, which is significantly negative (−0.53) when substitution would predict positive. Multicollinearity is an unlikely explanation, since every final-model VIF is below 6 (Section 3.4) and the sign is stable across both Economy candidate sets. A more probable cause is the same price endogeneity that affected the earlier own-fare estimates: 1st Class fares may move with factors that also drive Economy demand (general demand conditions, joint capacity or scheduling decisions), producing a spurious negative association rather than a genuine cross-price effect. Fare coefficients in this report — own or cross — should therefore not be used for fare-policy simulation without an instrument or better price data.</w:t>
+        <w:t xml:space="preserve">For Economy, the sign anomaly is instead in the cross-fare coefficient, which is significantly negative (−0.53) when substitution between the two classes would predict positive. As with 1st Class own fare, multicollinearity is unlikely (every final-model VIF is below 6, Section 3.5) and the sign is stable across the elimination run. The same endogenous fare-setting story plausibly applies here too: 1st Class fares may move with factors that also drive Economy demand, producing a spurious negative association rather than a genuine cross-price effect. Fare coefficients in this report — own or cross — should therefore not be used for fare-policy simulation without an instrument or better price data.</w:t>
       </w:r>
     </w:p>
     <w:p>
@@ -6981,7 +6668,7 @@
           <w:sz w:val="21"/>
           <w:szCs w:val="21"/>
         </w:rPr>
-        <w:t>Economy ridership is tied to the regional economy (elasticity about 1) and air-fare competition, and adjusts essentially within the quarter — backward elimination found no role for lagged demand in this class.</w:t>
+        <w:t>Economy ridership is tied to the regional economy (elasticity about 1) and air-fare competition; 1st Class ridership is tied almost entirely to its own fare (positive, see Section 4.3) and season. Neither class's final model contains a lagged-demand term (Section 3.2).</w:t>
       </w:r>
     </w:p>
     <w:p>
@@ -6999,7 +6686,7 @@
           <w:sz w:val="21"/>
           <w:szCs w:val="21"/>
         </w:rPr>
-        <w:t>Both classes have strong, stable seasonality, but 1st Class swings much more — about 47% between its Q3 trough and Q4 peak versus about 20% for Economy — so 1st Class capacity (rolling stock allocation, staffing) needs to flex more between quarters than Economy capacity.</w:t>
+        <w:t>Both classes have strong, stable seasonality, but 1st Class swings much more — about 33% between its Q3 trough and Q4 peak versus about 20% for Economy — so 1st Class capacity (rolling stock allocation, staffing) needs to flex more between quarters than Economy capacity.</w:t>
       </w:r>
     </w:p>
     <w:p>
@@ -7017,7 +6704,7 @@
           <w:sz w:val="21"/>
           <w:szCs w:val="21"/>
         </w:rPr>
-        <w:t>1st Class shows strong, statistically decisive evidence of habit persistence (γ = 0.455, p = 0.002; long-run responses about 1.8 times short-run). Because backward elimination let the data decide whether the lag belonged in the model rather than assuming it, this is a materially more confident finding than a judgement-based static/dynamic comparison would give: effects of a fare or service change on 1st Class ridership should be expected to build for more than one quarter before fully appearing.</w:t>
+        <w:t>This analysis finds no statistical support for habit persistence in either segment: both baseline γ estimates are insignificant at 5% (Section 3.2), so the decision rule used here assigns both classes the static form before any variable elimination takes place. Section 5.1 flags that, for 1st Class specifically, this conclusion is sensitive to the order in which the test is carried out.</w:t>
       </w:r>
     </w:p>
     <w:p>
@@ -7035,7 +6722,7 @@
           <w:sz w:val="21"/>
           <w:szCs w:val="21"/>
         </w:rPr>
-        <w:t xml:space="preserve">The two classes' cross-fare effects point in opposite directions — positive (as substitution theory predicts) for 1st Class, negative for Economy — so the wrong-signed own-fare finding of a fixed-specification approach turns out, on closer inspection (Section 4.3), to be more about how fares and demand co-move over time than a stable structural relationship.</w:t>
+        <w:t>The two classes' price anomalies point in different directions — 1st Class's own fare is wrong-signed, Economy's cross fare is wrong-signed — but both are consistent with the same underlying explanation: fares that respond to demand rather than the other way around (Section 4.3).</w:t>
       </w:r>
     </w:p>
     <w:p>
@@ -7095,7 +6782,7 @@
           <w:sz w:val="21"/>
           <w:szCs w:val="21"/>
         </w:rPr>
-        <w:t>Price endogeneity: the earlier own-fare puzzle is substantially resolved once lagged demand is modelled explicitly (Section 4.3), but Economy's negative cross-fare coefficient remains unexplained by demand theory and is most plausibly a symptom of the same endogenous fare-setting. This remains the main weakness of the models and limits their use for fare-policy analysis.</w:t>
+        <w:t>Price endogeneity: 1st Class own fare and Economy cross fare are both wrong-signed (Section 4.3), most plausibly because fares respond to demand rather than the other way around. This is the main weakness of the models and limits their use for fare-policy analysis.</w:t>
       </w:r>
     </w:p>
     <w:p>
@@ -7113,7 +6800,7 @@
           <w:sz w:val="21"/>
           <w:szCs w:val="21"/>
         </w:rPr>
-        <w:t>Backward elimination as a selection method: dropping variables based on in-sample p-values is known to inflate the apparent precision of what survives (post-selection inference) — the reported p-values and standard errors for the final models should be read as descriptive of this sample rather than as fully valid inferential statistics for a model specified in advance.</w:t>
+        <w:t>Order-sensitivity of the static/dynamic decision: γ is tested in the full baseline model, while still sharing variance with five collinear regressors (Section 3.2). A supplementary check — running backward elimination with the lag included as an ordinary candidate rather than pre-deciding its inclusion — shows 1st Class's γ becomes clearly significant (p = 0.002) once those collinear regressors are removed first. The “no lagged demand” conclusion for 1st Class in this report is therefore a consequence of the pre-committed decision rule and its ordering, not decisive evidence against habit persistence in that segment.</w:t>
       </w:r>
     </w:p>
     <w:p>
@@ -7131,7 +6818,7 @@
           <w:sz w:val="21"/>
           <w:szCs w:val="21"/>
         </w:rPr>
-        <w:t>Small sample: 36 quarterly observations (35 for the 1st Class dynamic model) for 4-6 parameters. Backward elimination reduced the parameter count relative to the baseline — a benefit for a sample this small — but power for any regressor that was dropped remains limited, and a variable eliminated here (e.g. GasPrice, Delays) could still have a genuine but undetectably small effect.</w:t>
+        <w:t>Backward elimination as a selection method: dropping variables based on in-sample p-values is known to inflate the apparent precision of what survives (post-selection inference) — the reported p-values and standard errors should be read as descriptive of this sample rather than as fully valid inferential statistics for a model specified in advance.</w:t>
       </w:r>
     </w:p>
     <w:p>
@@ -7149,7 +6836,7 @@
           <w:sz w:val="21"/>
           <w:szCs w:val="21"/>
         </w:rPr>
-        <w:t>Sensitivity to the significance threshold: elimination used α = 5% throughout. Some dropped regressors were close to that cutoff — notably Employment for 1st Class (p = 0.053) — so a different threshold, especially a looser 10%, could retain a different variable set. The reported specifications are the outcome of one reasonable, pre-committed rule, not the unique correct model.</w:t>
+        <w:t>Small sample: 36 quarterly observations for 4-6 parameters per final model. Backward elimination kept the parameter count low, which helps given the sample size, but power for any regressor that was dropped remains limited — a variable eliminated here (e.g. GasPrice, Delays) could still have a genuine but undetectably small effect. Elimination also used α = 5% throughout; some dropped regressors were close to that cutoff (notably Employment for 1st Class, p = 0.053), so a looser threshold could retain a different variable set.</w:t>
       </w:r>
     </w:p>
     <w:p>
@@ -7216,7 +6903,7 @@
           <w:sz w:val="21"/>
           <w:szCs w:val="21"/>
         </w:rPr>
-        <w:t>Log-log direct demand models were estimated for Economy and 1st Class ridership using backward elimination to select the variables and coefficients for each class, rather than fitting a fixed specification or hand-picking a multicollinearity remedy. The final Economy model is static: ridership is driven mainly by regional employment (elasticity ≈ 1) and, secondarily, by competing air fares, with strong, stable seasonality and no evidence of lagged demand — the lag term is eliminated whether or not it is offered as a candidate. The final 1st Class model is dynamic: none of its own-fare or general economic regressors survive, but a cross-fare effect (positive, as substitution theory predicts) and a strong, statistically decisive lagged-demand term (γ = 0.455, p = 0.002) do, together with the most pronounced seasonality of the two classes. Backward elimination also resolved, as a by-product, both the multicollinearity flagged in the baseline model (all final VIFs are below 6) and much of the earlier own-fare puzzle — the wrong-signed own-fare effect largely disappears once habit persistence is modelled explicitly. The one unresolved sign anomaly is Economy's negative cross-fare elasticity, most plausibly a symptom of fares and demand being jointly determined rather than a true behavioural effect. With that caveat, the models describe the drivers of ridership for each class well, but — like any single-equation model estimated on 36 quarterly observations with fares potentially endogenous — they should not yet be used to forecast the ridership effect of a specific fare change.</w:t>
+        <w:t>Log-log direct demand models were estimated for Economy and 1st Class ridership. For each class, the choice between a static and a dynamic (partial-adjustment) specification was made first, using a significance test on the lagged-ridership coefficient in the full baseline model (Section 3.2); backward elimination was then used to select the final variables and coefficients within whichever form was chosen (Section 3.3). Neither class's baseline lag coefficient is significant at 5% (Economy p = 0.623; 1st Class p = 0.131, with only a weak, inconclusive AIC edge toward the dynamic form), so both are assigned the static form and neither final model contains a lagged-demand term. The final Economy model retains cross fare, air fare and regional employment, which dominates (elasticity ≈ 1), with strong seasonality. The final 1st Class model retains only own fare, with a significant positive coefficient (+1.13) — the wrong sign for a genuine demand curve — alongside its own strong seasonality. This own-fare puzzle, together with Economy's significantly negative cross-fare coefficient, is most plausibly a symptom of price endogeneity (fares responding to demand) rather than a real behavioural relationship, and fare coefficients in this report should not be used for fare-policy simulation without an instrument. A secondary caveat concerns the order in which the static/dynamic decision was made: testing the lag's significance in the full, collinear baseline model can mask a real effect, and a supplementary check shows 1st Class's lag becomes clearly significant once the other collinear regressors are removed first (Section 5.1) — so the finding of “no lagged demand” for 1st Class should be read as a consequence of the decision rule and its ordering, not as conclusive evidence against habit persistence in that segment.</w:t>
       </w:r>
     </w:p>
     <w:sectPr>

</xml_diff>